<commit_message>
Bibliography: alphabetical order, remove editor note
Co-Authored-By: Claude Fable 5.1 <noreply@anthropic.com>
Claude-Session: https://claude.ai/code/session_011Z9C2ptByc9jQga6MDruQz
</commit_message>
<xml_diff>
--- a/deliverables/סמינריון_הדיל_אחרי_משוב_גילת.docx
+++ b/deliverables/סמינריון_הדיל_אחרי_משוב_גילת.docx
@@ -8495,164 +8495,6 @@
     <w:p>
       <w:pPr>
         <w:bidi/>
-        <w:spacing w:after="120" w:line="360"/>
-        <w:jc w:val="both"/>
-      </w:pPr>
-      <w:r>
-        <w:rPr>
-          <w:rFonts w:ascii="Times New Roman" w:cs="David" w:eastAsia="David" w:hAnsi="Times New Roman"/>
-          <w:b w:val="false"/>
-          <w:bCs w:val="false"/>
-          <w:i w:val="false"/>
-          <w:iCs w:val="false"/>
-          <w:sz w:val="24"/>
-          <w:szCs w:val="24"/>
-          <w:highlight w:val="yellow"/>
-          <w:rtl/>
-        </w:rPr>
-        <w:t xml:space="preserve">הרשימה מאחדת את כל המקורות שאוזכרו בפרקים. שבעת המאמרים העבריים מהשנים 2021 עד 2025 אותרו באינטרנט בגישה מלאה, אך את פרטי הפריט המסומנים בצהוב (שם מחבר, גיליון, עמודים) יש להשלים מהעמוד הראשון של קובץ המאמר, ולאמת כל פריט מול קטלוג הספרייה לפני ההגשה. את כתובות האינטרנט אפשר להשאיר או להסיר לפי הנחיות המכללה.</w:t>
-      </w:r>
-    </w:p>
-    <w:p>
-      <w:pPr>
-        <w:bidi/>
-        <w:spacing w:after="360" w:line="240"/>
-        <w:ind w:left="0" w:right="708" w:hanging="708"/>
-        <w:jc w:val="both"/>
-      </w:pPr>
-      <w:r>
-        <w:rPr>
-          <w:rFonts w:ascii="Times New Roman" w:cs="David" w:eastAsia="David" w:hAnsi="Times New Roman"/>
-          <w:i w:val="false"/>
-          <w:iCs w:val="false"/>
-          <w:sz w:val="24"/>
-          <w:szCs w:val="24"/>
-          <w:rtl/>
-        </w:rPr>
-        <w:t xml:space="preserve">שור, י׳, גוברמן, ע׳ ואובסיאניקוב, ס׳ </w:t>
-      </w:r>
-      <w:r>
-        <w:rPr>
-          <w:rFonts w:ascii="Times New Roman" w:cs="David" w:eastAsia="David" w:hAnsi="Times New Roman"/>
-          <w:i w:val="false"/>
-          <w:iCs w:val="false"/>
-          <w:sz w:val="24"/>
-          <w:szCs w:val="24"/>
-          <w:rtl/>
-        </w:rPr>
-        <w:t xml:space="preserve">[לאמת שמות ושנה]</w:t>
-      </w:r>
-      <w:r>
-        <w:rPr>
-          <w:rFonts w:ascii="Times New Roman" w:cs="David" w:eastAsia="David" w:hAnsi="Times New Roman"/>
-          <w:i w:val="false"/>
-          <w:iCs w:val="false"/>
-          <w:sz w:val="24"/>
-          <w:szCs w:val="24"/>
-          <w:rtl/>
-        </w:rPr>
-        <w:t xml:space="preserve"> (2023). שינוי תפיסתי בנוגע למונח הוראה או למידה בקרב מורים ותיקים בעקבות התנסות בלמידה קשובה. </w:t>
-      </w:r>
-      <w:r>
-        <w:rPr>
-          <w:rFonts w:ascii="Times New Roman" w:cs="David" w:eastAsia="David" w:hAnsi="Times New Roman"/>
-          <w:i/>
-          <w:iCs/>
-          <w:sz w:val="24"/>
-          <w:szCs w:val="24"/>
-          <w:rtl/>
-        </w:rPr>
-        <w:t xml:space="preserve">במעגלי חינוך: מחקר, עיון ויצירה, 12</w:t>
-      </w:r>
-      <w:r>
-        <w:rPr>
-          <w:rFonts w:ascii="Times New Roman" w:cs="David" w:eastAsia="David" w:hAnsi="Times New Roman"/>
-          <w:i w:val="false"/>
-          <w:iCs w:val="false"/>
-          <w:sz w:val="24"/>
-          <w:szCs w:val="24"/>
-          <w:rtl/>
-        </w:rPr>
-        <w:t xml:space="preserve">. https://www.dyellin.ac.il/sites/default/files/journals/journaleducation/edition12/perceptual_change_regarding_the_term_teaching_or_learning_among_veteran_teachers_fallowing_experiencing_attentive_learning.pdf</w:t>
-      </w:r>
-    </w:p>
-    <w:p>
-      <w:pPr>
-        <w:bidi/>
-        <w:spacing w:after="360" w:line="240"/>
-        <w:ind w:left="0" w:right="708" w:hanging="708"/>
-        <w:jc w:val="both"/>
-      </w:pPr>
-      <w:r>
-        <w:rPr>
-          <w:rFonts w:ascii="Times New Roman" w:cs="David" w:eastAsia="David" w:hAnsi="Times New Roman"/>
-          <w:i w:val="false"/>
-          <w:iCs w:val="false"/>
-          <w:sz w:val="24"/>
-          <w:szCs w:val="24"/>
-          <w:rtl/>
-        </w:rPr>
-        <w:t xml:space="preserve">[שם המחבר/ת]</w:t>
-      </w:r>
-      <w:r>
-        <w:rPr>
-          <w:rFonts w:ascii="Times New Roman" w:cs="David" w:eastAsia="David" w:hAnsi="Times New Roman"/>
-          <w:i w:val="false"/>
-          <w:iCs w:val="false"/>
-          <w:sz w:val="24"/>
-          <w:szCs w:val="24"/>
-          <w:rtl/>
-        </w:rPr>
-        <w:t xml:space="preserve"> (2024). פדגוגיה דיאלוגית בהכשרת מורים: בין הלכה למעשה. </w:t>
-      </w:r>
-      <w:r>
-        <w:rPr>
-          <w:rFonts w:ascii="Times New Roman" w:cs="David" w:eastAsia="David" w:hAnsi="Times New Roman"/>
-          <w:i/>
-          <w:iCs/>
-          <w:sz w:val="24"/>
-          <w:szCs w:val="24"/>
-          <w:rtl/>
-        </w:rPr>
-        <w:t xml:space="preserve">במעגלי חינוך: מחקר, עיון ויצירה, 13</w:t>
-      </w:r>
-      <w:r>
-        <w:rPr>
-          <w:rFonts w:ascii="Times New Roman" w:cs="David" w:eastAsia="David" w:hAnsi="Times New Roman"/>
-          <w:i w:val="false"/>
-          <w:iCs w:val="false"/>
-          <w:sz w:val="24"/>
-          <w:szCs w:val="24"/>
-          <w:rtl/>
-        </w:rPr>
-        <w:t xml:space="preserve"> </w:t>
-      </w:r>
-      <w:r>
-        <w:rPr>
-          <w:rFonts w:ascii="Times New Roman" w:cs="David" w:eastAsia="David" w:hAnsi="Times New Roman"/>
-          <w:i w:val="false"/>
-          <w:iCs w:val="false"/>
-          <w:sz w:val="24"/>
-          <w:szCs w:val="24"/>
-          <w:rtl/>
-        </w:rPr>
-        <w:t xml:space="preserve">[לאמת גיליון ושנה]</w:t>
-      </w:r>
-      <w:r>
-        <w:rPr>
-          <w:rFonts w:ascii="Times New Roman" w:cs="David" w:eastAsia="David" w:hAnsi="Times New Roman"/>
-          <w:i w:val="false"/>
-          <w:iCs w:val="false"/>
-          <w:sz w:val="24"/>
-          <w:szCs w:val="24"/>
-          <w:rtl/>
-        </w:rPr>
-        <w:t xml:space="preserve">. https://www.dyellin.ac.il/sites/default/files/2025-11/dialogic_pedagogy_in_teacher_education_between_theory_and_practice.pdf</w:t>
-      </w:r>
-    </w:p>
-    <w:p>
-      <w:pPr>
-        <w:bidi/>
         <w:spacing w:after="360" w:line="240"/>
         <w:ind w:left="0" w:right="708" w:hanging="708"/>
         <w:jc w:val="both"/>
@@ -9180,7 +9022,29 @@
           <w:szCs w:val="24"/>
           <w:rtl/>
         </w:rPr>
-        <w:t xml:space="preserve">שלסקי, ש׳ (2006). מחקר פעולה כמחקר רפלקסיבי. בתוך ד׳ לוי (עורכת), </w:t>
+        <w:t xml:space="preserve">שור, י׳, גוברמן, ע׳ ואובסיאניקוב, ס׳ </w:t>
+      </w:r>
+      <w:r>
+        <w:rPr>
+          <w:rFonts w:ascii="Times New Roman" w:cs="David" w:eastAsia="David" w:hAnsi="Times New Roman"/>
+          <w:i w:val="false"/>
+          <w:iCs w:val="false"/>
+          <w:sz w:val="24"/>
+          <w:szCs w:val="24"/>
+          <w:rtl/>
+        </w:rPr>
+        <w:t xml:space="preserve">[לאמת שמות ושנה]</w:t>
+      </w:r>
+      <w:r>
+        <w:rPr>
+          <w:rFonts w:ascii="Times New Roman" w:cs="David" w:eastAsia="David" w:hAnsi="Times New Roman"/>
+          <w:i w:val="false"/>
+          <w:iCs w:val="false"/>
+          <w:sz w:val="24"/>
+          <w:szCs w:val="24"/>
+          <w:rtl/>
+        </w:rPr>
+        <w:t xml:space="preserve"> (2023). שינוי תפיסתי בנוגע למונח הוראה או למידה בקרב מורים ותיקים בעקבות התנסות בלמידה קשובה. </w:t>
       </w:r>
       <w:r>
         <w:rPr>
@@ -9191,18 +9055,18 @@
           <w:szCs w:val="24"/>
           <w:rtl/>
         </w:rPr>
-        <w:t xml:space="preserve">מחקר פעולה: הלכה למעשה. זיקות פילוסופיות ומתודולוגיות בין מחקר פעולה לבין פרדיגמת המחקר האיכותי</w:t>
-      </w:r>
-      <w:r>
-        <w:rPr>
-          <w:rFonts w:ascii="Times New Roman" w:cs="David" w:eastAsia="David" w:hAnsi="Times New Roman"/>
-          <w:i w:val="false"/>
-          <w:iCs w:val="false"/>
-          <w:sz w:val="24"/>
-          <w:szCs w:val="24"/>
-          <w:rtl/>
-        </w:rPr>
-        <w:t xml:space="preserve"> (עמ׳ 33-54). מכון מופ״ת.</w:t>
+        <w:t xml:space="preserve">במעגלי חינוך: מחקר, עיון ויצירה, 12</w:t>
+      </w:r>
+      <w:r>
+        <w:rPr>
+          <w:rFonts w:ascii="Times New Roman" w:cs="David" w:eastAsia="David" w:hAnsi="Times New Roman"/>
+          <w:i w:val="false"/>
+          <w:iCs w:val="false"/>
+          <w:sz w:val="24"/>
+          <w:szCs w:val="24"/>
+          <w:rtl/>
+        </w:rPr>
+        <w:t xml:space="preserve">. https://www.dyellin.ac.il/sites/default/files/journals/journaleducation/edition12/perceptual_change_regarding_the_term_teaching_or_learning_among_veteran_teachers_fallowing_experiencing_attentive_learning.pdf</w:t>
       </w:r>
     </w:p>
     <w:p>
@@ -9221,7 +9085,7 @@
           <w:szCs w:val="24"/>
           <w:rtl/>
         </w:rPr>
-        <w:t xml:space="preserve">שקדי, א׳ (2003). </w:t>
+        <w:t xml:space="preserve">שלסקי, ש׳ (2006). מחקר פעולה כמחקר רפלקסיבי. בתוך ד׳ לוי (עורכת), </w:t>
       </w:r>
       <w:r>
         <w:rPr>
@@ -9232,6 +9096,47 @@
           <w:szCs w:val="24"/>
           <w:rtl/>
         </w:rPr>
+        <w:t xml:space="preserve">מחקר פעולה: הלכה למעשה. זיקות פילוסופיות ומתודולוגיות בין מחקר פעולה לבין פרדיגמת המחקר האיכותי</w:t>
+      </w:r>
+      <w:r>
+        <w:rPr>
+          <w:rFonts w:ascii="Times New Roman" w:cs="David" w:eastAsia="David" w:hAnsi="Times New Roman"/>
+          <w:i w:val="false"/>
+          <w:iCs w:val="false"/>
+          <w:sz w:val="24"/>
+          <w:szCs w:val="24"/>
+          <w:rtl/>
+        </w:rPr>
+        <w:t xml:space="preserve"> (עמ׳ 33-54). מכון מופ״ת.</w:t>
+      </w:r>
+    </w:p>
+    <w:p>
+      <w:pPr>
+        <w:bidi/>
+        <w:spacing w:after="360" w:line="240"/>
+        <w:ind w:left="0" w:right="708" w:hanging="708"/>
+        <w:jc w:val="both"/>
+      </w:pPr>
+      <w:r>
+        <w:rPr>
+          <w:rFonts w:ascii="Times New Roman" w:cs="David" w:eastAsia="David" w:hAnsi="Times New Roman"/>
+          <w:i w:val="false"/>
+          <w:iCs w:val="false"/>
+          <w:sz w:val="24"/>
+          <w:szCs w:val="24"/>
+          <w:rtl/>
+        </w:rPr>
+        <w:t xml:space="preserve">שקדי, א׳ (2003). </w:t>
+      </w:r>
+      <w:r>
+        <w:rPr>
+          <w:rFonts w:ascii="Times New Roman" w:cs="David" w:eastAsia="David" w:hAnsi="Times New Roman"/>
+          <w:i/>
+          <w:iCs/>
+          <w:sz w:val="24"/>
+          <w:szCs w:val="24"/>
+          <w:rtl/>
+        </w:rPr>
         <w:t xml:space="preserve">מילים המנסות לגעת: מחקר איכותני, תאוריה ויישום</w:t>
       </w:r>
       <w:r>
@@ -9244,6 +9149,80 @@
           <w:rtl/>
         </w:rPr>
         <w:t xml:space="preserve">. רמות.</w:t>
+      </w:r>
+    </w:p>
+    <w:p>
+      <w:pPr>
+        <w:bidi/>
+        <w:spacing w:after="360" w:line="240"/>
+        <w:ind w:left="0" w:right="708" w:hanging="708"/>
+        <w:jc w:val="both"/>
+      </w:pPr>
+      <w:r>
+        <w:rPr>
+          <w:rFonts w:ascii="Times New Roman" w:cs="David" w:eastAsia="David" w:hAnsi="Times New Roman"/>
+          <w:i w:val="false"/>
+          <w:iCs w:val="false"/>
+          <w:sz w:val="24"/>
+          <w:szCs w:val="24"/>
+          <w:rtl/>
+        </w:rPr>
+        <w:t xml:space="preserve">[שם המחבר/ת]</w:t>
+      </w:r>
+      <w:r>
+        <w:rPr>
+          <w:rFonts w:ascii="Times New Roman" w:cs="David" w:eastAsia="David" w:hAnsi="Times New Roman"/>
+          <w:i w:val="false"/>
+          <w:iCs w:val="false"/>
+          <w:sz w:val="24"/>
+          <w:szCs w:val="24"/>
+          <w:rtl/>
+        </w:rPr>
+        <w:t xml:space="preserve"> (2024). פדגוגיה דיאלוגית בהכשרת מורים: בין הלכה למעשה. </w:t>
+      </w:r>
+      <w:r>
+        <w:rPr>
+          <w:rFonts w:ascii="Times New Roman" w:cs="David" w:eastAsia="David" w:hAnsi="Times New Roman"/>
+          <w:i/>
+          <w:iCs/>
+          <w:sz w:val="24"/>
+          <w:szCs w:val="24"/>
+          <w:rtl/>
+        </w:rPr>
+        <w:t xml:space="preserve">במעגלי חינוך: מחקר, עיון ויצירה, 13</w:t>
+      </w:r>
+      <w:r>
+        <w:rPr>
+          <w:rFonts w:ascii="Times New Roman" w:cs="David" w:eastAsia="David" w:hAnsi="Times New Roman"/>
+          <w:i w:val="false"/>
+          <w:iCs w:val="false"/>
+          <w:sz w:val="24"/>
+          <w:szCs w:val="24"/>
+          <w:rtl/>
+        </w:rPr>
+        <w:t xml:space="preserve"> </w:t>
+      </w:r>
+      <w:r>
+        <w:rPr>
+          <w:rFonts w:ascii="Times New Roman" w:cs="David" w:eastAsia="David" w:hAnsi="Times New Roman"/>
+          <w:i w:val="false"/>
+          <w:iCs w:val="false"/>
+          <w:sz w:val="24"/>
+          <w:szCs w:val="24"/>
+          <w:rtl/>
+        </w:rPr>
+        <w:t xml:space="preserve">[לאמת גיליון ושנה]</w:t>
+      </w:r>
+      <w:r>
+        <w:rPr>
+          <w:rFonts w:ascii="Times New Roman" w:cs="David" w:eastAsia="David" w:hAnsi="Times New Roman"/>
+          <w:i w:val="false"/>
+          <w:iCs w:val="false"/>
+          <w:sz w:val="24"/>
+          <w:szCs w:val="24"/>
+          <w:rtl/>
+        </w:rPr>
+        <w:t xml:space="preserve">. https://www.dyellin.ac.il/sites/default/files/2025-11/dialogic_pedagogy_in_teacher_education_between_theory_and_practice.pdf</w:t>
       </w:r>
     </w:p>
     <w:p>

</xml_diff>

<commit_message>
Verify Shor & Guberman (2023) reference against the article and fix citations
Co-Authored-By: Claude Fable 5.1 <noreply@anthropic.com>
Claude-Session: https://claude.ai/code/session_011Z9C2ptByc9jQga6MDruQz
</commit_message>
<xml_diff>
--- a/deliverables/סמינריון_הדיל_אחרי_משוב_גילת.docx
+++ b/deliverables/סמינריון_הדיל_אחרי_משוב_גילת.docx
@@ -1097,34 +1097,7 @@
           <w:szCs w:val="24"/>
           <w:rtl/>
         </w:rPr>
-        <w:t xml:space="preserve">מחקרים ישראליים מתארים מה מורות לומדות בדרך זו. רונן (2019) מתעדת את התפתחותה כמובילת תהליך חינוכי ומראה כיצד תיעוד מתמשך ובחינה חוזרת של הפעולות הובילו אותה לזהות פערים בין הראוי למצוי, להשהות תגובות אוטומטיות ולסבול אי-ודאות. מנדלר, עמיר, האופטמן וגורב (2020) עוקבים אחר סטודנטים להוראה שניסחו שאלת מחקר פעולה, ומתארים מעבר מתחושת אי-נחת כללית לשאלה ממוקדת על פעולותיהם שלהם, מעבר שהם מכנים כניסה למרחב בטוח. מחקר על מורים ותיקים שהתנסו בלמידה קשובה מתאר שינוי תפיסתי מעיסוק בהוראה לעיסוק בלמידה, ומצביע על הציור כביטוי אישי של הלמידה (שור, גוברמן ואובסיאניקוב, 2023 </w:t>
-      </w:r>
-      <w:r>
-        <w:rPr>
-          <w:rFonts w:ascii="Times New Roman" w:cs="David" w:eastAsia="David" w:hAnsi="Times New Roman"/>
-          <w:b w:val="false"/>
-          <w:bCs w:val="false"/>
-          <w:i w:val="false"/>
-          <w:iCs w:val="false"/>
-          <w:sz w:val="24"/>
-          <w:szCs w:val="24"/>
-          <w:highlight w:val="yellow"/>
-          <w:rtl/>
-        </w:rPr>
-        <w:t xml:space="preserve">[לאמת]</w:t>
-      </w:r>
-      <w:r>
-        <w:rPr>
-          <w:rFonts w:ascii="Times New Roman" w:cs="David" w:eastAsia="David" w:hAnsi="Times New Roman"/>
-          <w:b w:val="false"/>
-          <w:bCs w:val="false"/>
-          <w:i w:val="false"/>
-          <w:iCs w:val="false"/>
-          <w:sz w:val="24"/>
-          <w:szCs w:val="24"/>
-          <w:rtl/>
-        </w:rPr>
-        <w:t xml:space="preserve">). ממחקרים אלה עולה שהוראה מותאמת אינה נרכשת רק מקריאה על אסטרטגיות, אלא מניסיון מתועד בכיתה, שבו המורה בודקת מה קורה כאשר היא משנה פעולה אחת, ולומדת מכך על ההנחות שלה עצמה.</w:t>
+        <w:t xml:space="preserve">מחקרים ישראליים מתארים מה מורות לומדות בדרך זו. רונן (2019) מתעדת את התפתחותה כמובילת תהליך חינוכי ומראה כיצד תיעוד מתמשך ובחינה חוזרת של הפעולות הובילו אותה לזהות פערים בין הראוי למצוי, להשהות תגובות אוטומטיות ולסבול אי-ודאות. מנדלר, עמיר, האופטמן וגורב (2020) עוקבים אחר סטודנטים להוראה שניסחו שאלת מחקר פעולה, ומתארים מעבר מתחושת אי-נחת כללית לשאלה ממוקדת על פעולותיהם שלהם, מעבר שהם מכנים כניסה למרחב בטוח. מחקר על מורות ותיקות שהתנסו בהוראה קשובה, שיטה דיאלוגית שבה הלומדים מייצגים מושגים באמצעות ציורים והסברים בכתב, מתאר שינוי תפיסתי מהוראה כהעברת ידע חד-כיוונית להוראה ולמידה כתהליך הדדי, ומצביע על הציור ככלי לעקוב אחר השינוי המושגי של הלומד (שור וגוברמן, 2023). ממחקרים אלה עולה שהוראה מותאמת אינה נרכשת רק מקריאה על אסטרטגיות, אלא מניסיון מתועד בכיתה, שבו המורה בודקת מה קורה כאשר היא משנה פעולה אחת, ולומדת מכך על ההנחות שלה עצמה.</w:t>
       </w:r>
     </w:p>
     <w:p>
@@ -8142,34 +8115,7 @@
           <w:szCs w:val="24"/>
           <w:rtl/>
         </w:rPr>
-        <w:t xml:space="preserve">לבסוף, השינוי בי כמורה-חוקרת מתיישב עם תיאורו של מחקר הפעולה כמחזורים של פעולה ורפלקציה, שבהם כל מפגש מוליד החלטה לקראת הבא (צלרמאיר, 2001; McNiff &amp; Whitehead, 2005). רונן (2019), במחקר עצמי על התפתחותה כמובילת תהליך, מתארת כיצד למדה להשהות את התגובה האוטומטית ולסבול אי-ודאות. אני מזהה תהליך דומה בעצמי: החשש מהאי-סדר בזמן עבודה בקבוצות התחלף בהבנה שהוא חלק מלמידה פעילה. מחקר על מורים ותיקים שהתנסו בלמידה קשובה מתאר שינוי תפיסתי דומה, מעיסוק במונח הוראה לעיסוק במונח למידה, ומציין שציור הוא ביטוי אישי של הלמידה שדרכו הלומד מחבר את הנלמד לעולמו (שור ואחרים, 2023 </w:t>
-      </w:r>
-      <w:r>
-        <w:rPr>
-          <w:rFonts w:ascii="Times New Roman" w:cs="David" w:eastAsia="David" w:hAnsi="Times New Roman"/>
-          <w:b w:val="false"/>
-          <w:bCs w:val="false"/>
-          <w:i w:val="false"/>
-          <w:iCs w:val="false"/>
-          <w:sz w:val="24"/>
-          <w:szCs w:val="24"/>
-          <w:highlight w:val="yellow"/>
-          <w:rtl/>
-        </w:rPr>
-        <w:t xml:space="preserve">[לאמת]</w:t>
-      </w:r>
-      <w:r>
-        <w:rPr>
-          <w:rFonts w:ascii="Times New Roman" w:cs="David" w:eastAsia="David" w:hAnsi="Times New Roman"/>
-          <w:b w:val="false"/>
-          <w:bCs w:val="false"/>
-          <w:i w:val="false"/>
-          <w:iCs w:val="false"/>
-          <w:sz w:val="24"/>
-          <w:szCs w:val="24"/>
-          <w:rtl/>
-        </w:rPr>
-        <w:t xml:space="preserve">). הדגם של אחמד והציורים של חבריו היו עבורי בדיוק ביטוי כזה. גם שינוי שאלת המחקר שלי, מהשפעה על התלמידים לשינוי בפעולותיי, הוא חלק מהתהליך שמתארים מנדלר ואחרים (2020) אצל סטודנטים להוראה העורכים מחקר פעולה.</w:t>
+        <w:t xml:space="preserve">לבסוף, השינוי בי כמורה-חוקרת מתיישב עם תיאורו של מחקר הפעולה כמחזורים של פעולה ורפלקציה, שבהם כל מפגש מוליד החלטה לקראת הבא (צלרמאיר, 2001; McNiff &amp; Whitehead, 2005). רונן (2019), במחקר עצמי על התפתחותה כמובילת תהליך, מתארת כיצד למדה להשהות את התגובה האוטומטית ולסבול אי-ודאות. אני מזהה תהליך דומה בעצמי: החשש מהאי-סדר בזמן עבודה בקבוצות התחלף בהבנה שהוא חלק מלמידה פעילה. מחקר על מורות ותיקות שהתנסו בהוראה קשובה מתאר שינוי תפיסתי דומה, מהוראה כהעברת ידע חד-כיוונית להוראה ולמידה כתהליך הדדי ורב-כיווני, ומראה שציור של מושג הוא ביטוי אישי שדרכו אפשר לעקוב אחר השינוי המושגי של הלומד (שור וגוברמן, 2023). הדגם של אחמד והציורים של חבריו היו עבורי בדיוק ביטוי כזה. גם שינוי שאלת המחקר שלי, מהשפעה על התלמידים לשינוי בפעולותיי, הוא חלק מהתהליך שמתארים מנדלר ואחרים (2020) אצל סטודנטים להוראה העורכים מחקר פעולה.</w:t>
       </w:r>
     </w:p>
     <w:p>
@@ -9022,51 +8968,7 @@
           <w:szCs w:val="24"/>
           <w:rtl/>
         </w:rPr>
-        <w:t xml:space="preserve">שור, י׳, גוברמן, ע׳ ואובסיאניקוב, ס׳ </w:t>
-      </w:r>
-      <w:r>
-        <w:rPr>
-          <w:rFonts w:ascii="Times New Roman" w:cs="David" w:eastAsia="David" w:hAnsi="Times New Roman"/>
-          <w:i w:val="false"/>
-          <w:iCs w:val="false"/>
-          <w:sz w:val="24"/>
-          <w:szCs w:val="24"/>
-          <w:rtl/>
-        </w:rPr>
-        <w:t xml:space="preserve">[לאמת שמות ושנה]</w:t>
-      </w:r>
-      <w:r>
-        <w:rPr>
-          <w:rFonts w:ascii="Times New Roman" w:cs="David" w:eastAsia="David" w:hAnsi="Times New Roman"/>
-          <w:i w:val="false"/>
-          <w:iCs w:val="false"/>
-          <w:sz w:val="24"/>
-          <w:szCs w:val="24"/>
-          <w:rtl/>
-        </w:rPr>
-        <w:t xml:space="preserve"> (2023). שינוי תפיסתי בנוגע למונח הוראה או למידה בקרב מורים ותיקים בעקבות התנסות בלמידה קשובה. </w:t>
-      </w:r>
-      <w:r>
-        <w:rPr>
-          <w:rFonts w:ascii="Times New Roman" w:cs="David" w:eastAsia="David" w:hAnsi="Times New Roman"/>
-          <w:i/>
-          <w:iCs/>
-          <w:sz w:val="24"/>
-          <w:szCs w:val="24"/>
-          <w:rtl/>
-        </w:rPr>
-        <w:t xml:space="preserve">במעגלי חינוך: מחקר, עיון ויצירה, 12</w:t>
-      </w:r>
-      <w:r>
-        <w:rPr>
-          <w:rFonts w:ascii="Times New Roman" w:cs="David" w:eastAsia="David" w:hAnsi="Times New Roman"/>
-          <w:i w:val="false"/>
-          <w:iCs w:val="false"/>
-          <w:sz w:val="24"/>
-          <w:szCs w:val="24"/>
-          <w:rtl/>
-        </w:rPr>
-        <w:t xml:space="preserve">. https://www.dyellin.ac.il/sites/default/files/journals/journaleducation/edition12/perceptual_change_regarding_the_term_teaching_or_learning_among_veteran_teachers_fallowing_experiencing_attentive_learning.pdf</w:t>
+        <w:t xml:space="preserve">שור, י׳ וגוברמן, ע׳ (2023). שינוי תפיסתי של המושג "הוראה / למידה" בקרב מורות ותיקות בעקבות התנסות בהוראה קשובה. במעגלי חינוך: מחקר, עיון ויצירה, 12. https://www.dyellin.ac.il/sites/default/files/journals/journaleducation/edition12/perceptual_change_regarding_the_term_teaching_or_learning_among_veteran_teachers_fallowing_experiencing_attentive_learning.pdf</w:t>
       </w:r>
     </w:p>
     <w:p>

</xml_diff>

<commit_message>
APA 7 alignment: et al. citations, Hebrew initials, italics, figure/table numbering with notes
Co-Authored-By: Claude Fable 5.1 <noreply@anthropic.com>
Claude-Session: https://claude.ai/code/session_011Z9C2ptByc9jQga6MDruQz
</commit_message>
<xml_diff>
--- a/deliverables/סמינריון_הדיל_אחרי_משוב_גילת.docx
+++ b/deliverables/סמינריון_הדיל_אחרי_משוב_גילת.docx
@@ -647,7 +647,7 @@
           <w:szCs w:val="24"/>
           <w:rtl/>
         </w:rPr>
-        <w:t xml:space="preserve">מסגרת נוספת, שצמחה מתחום החינוך המיוחד והתרחבה לכלל הכיתות, היא עיצוב אוניברסלי ללמידה (Universal Design for Learning). לפי מסגרת זו, במקום להתאים בדיעבד את השיעור לתלמידים שמתקשים, יש לתכנן אותו מראש כך שיציע דרכים מרובות של ייצוג המידע, דרכים מרובות של פעולה והבעה, ודרכים מרובות של מעורבות (Meyer, Rose &amp; Gordon, 2014). ההנחה היא שמה שנחוץ לתלמידים עם קשיים מיטיב גם עם שאר הכיתה. שתי המסגרות, הוראה מותאמת ועיצוב אוניברסלי, משלימות זו את זו: הראשונה מדריכה את המורה כיצד להגיב לשונות, והשנייה כיצד לתכנן מלכתחילה סביבה שמצמצמת חסמים.</w:t>
+        <w:t xml:space="preserve">מסגרת נוספת, שצמחה מתחום החינוך המיוחד והתרחבה לכלל הכיתות, היא עיצוב אוניברסלי ללמידה (Universal Design for Learning). לפי מסגרת זו, במקום להתאים בדיעבד את השיעור לתלמידים שמתקשים, יש לתכנן אותו מראש כך שיציע דרכים מרובות של ייצוג המידע, דרכים מרובות של פעולה והבעה, ודרכים מרובות של מעורבות (Meyer et al., 2014). ההנחה היא שמה שנחוץ לתלמידים עם קשיים מיטיב גם עם שאר הכיתה. שתי המסגרות, הוראה מותאמת ועיצוב אוניברסלי, משלימות זו את זו: הראשונה מדריכה את המורה כיצד להגיב לשונות, והשנייה כיצד לתכנן מלכתחילה סביבה שמצמצמת חסמים.</w:t>
       </w:r>
     </w:p>
     <w:p>
@@ -893,47 +893,47 @@
           <w:szCs w:val="24"/>
           <w:rtl/>
         </w:rPr>
-        <w:t xml:space="preserve">הספרות מבחינה בין מתן בחירה לבין תמיכה באוטונומיה במובן הרחב. מחקר ישראלי שבחן התנהגויות מורים מצא שמתן בחירה תורם למעורבות, אך שהתנהגויות אחרות תורמות אף יותר: הסבר של הרלוונטיות של המשימה לחיי התלמיד, הקשבה לביקורת שלו, ומתן אפשרות לעבוד בדרכו. לעומת זאת, דיכוי ביטוי של דעות והתערבות בקצב העבודה נמצאו פוגעים במעורבות (Assor, Kaplan &amp; Roth, 2002). ריב מוסיף שמורה תומך אוטונומיה מקשיב, מציג שיקולים במקום פקודות, מכיר ברגשות שליליים של תלמידים כלפי משימה, ומשתמש בשפה מזמינה ולא כופה (Reeve, 2009).</w:t>
-      </w:r>
-    </w:p>
-    <w:p>
-      <w:pPr>
-        <w:bidi/>
-        <w:spacing w:after="120" w:line="360"/>
-        <w:jc w:val="both"/>
-      </w:pPr>
-      <w:r>
-        <w:rPr>
-          <w:rFonts w:ascii="Times New Roman" w:cs="David" w:eastAsia="David" w:hAnsi="Times New Roman"/>
-          <w:b w:val="false"/>
-          <w:bCs w:val="false"/>
-          <w:i w:val="false"/>
-          <w:iCs w:val="false"/>
-          <w:sz w:val="24"/>
-          <w:szCs w:val="24"/>
-          <w:rtl/>
-        </w:rPr>
-        <w:t xml:space="preserve">מטה-אנליזה של מחקרים על בחירה מצאה שמתן בחירה משפיע לטובה על מוטיבציה פנימית, על מאמץ, על ביצוע ועל תחושת מסוגלות, אך שהאפקט תלוי בתנאים: בחירה בין מספר מצומצם של אפשרויות, שתיים עד ארבע, יעילה יותר מבחירה בין רבות; בחירה שנוגעת לעניין משמעותי, כמו דרך הביצוע של משימה, יעילה יותר מבחירה טכנית; ובחירות שאינן מלוות בלחץ חיצוני יעילות יותר (Patall, Cooper &amp; Robinson, 2008). מכאן שמתן בחירה בדרך ההבעה, כפי שמציעה טומלינסון בהתאמת התוצר, הוא דוגמה לצומת שבו הוראה מותאמת ותמיכה באוטונומיה נפגשות: התלמיד בוחר כיצד להראות את הבנתו, ובכך גם מתאים את המשימה לחוזקותיו וגם חווה בעלות עליה.</w:t>
-      </w:r>
-    </w:p>
-    <w:p>
-      <w:pPr>
-        <w:bidi/>
-        <w:spacing w:after="120" w:line="360"/>
-        <w:jc w:val="both"/>
-      </w:pPr>
-      <w:r>
-        <w:rPr>
-          <w:rFonts w:ascii="Times New Roman" w:cs="David" w:eastAsia="David" w:hAnsi="Times New Roman"/>
-          <w:b w:val="false"/>
-          <w:bCs w:val="false"/>
-          <w:i w:val="false"/>
-          <w:iCs w:val="false"/>
-          <w:sz w:val="24"/>
-          <w:szCs w:val="24"/>
-          <w:rtl/>
-        </w:rPr>
-        <w:t xml:space="preserve">כיצד נותנים אוטונומיה בשיעור בפועל? ריב מפרט התנהגויות מורה שנמצאו תומכות באוטונומיה: להסביר מדוע המשימה חשובה ומה הקשר שלה לחיי התלמיד; להשתמש בשפה מזמינה, כגון 'אפשר', 'אם תרצו' ו'מה דעתכם', במקום בשפה כופה, כגון 'חייבים' ו'אסור'; להכיר ברגשות שליליים של תלמידים כלפי משימה במקום לבטל אותם; להקשיב לפני שמגיבים; ולתת זמן לעבודה עצמאית בלי להתערב בקצב (Reeve, 2009). אסור, קפלן ורוט מוסיפים שההתנהגות שנמצאה מזיקה ביותר היא דיכוי של ביקורת ושל ביטוי דעה (Assor et al., 2002). מנקודת המבט של ההיוטגוגיה, גלסנר (2024) מציע שהבחירה תנבע מעניין ומסקרנות של הלומדים ולא רק מתפריט שהמורה קבע, כלומר שהמורה תשאיר מקום גם להצעות שהתלמידים מביאים בעצמם. אלה פעולות קטנות בניסוח ובזמן, אך הספרות מייחסת להן השפעה על המוטיבציה שאינה נופלת מזו של מתן הבחירה עצמו.</w:t>
+        <w:t xml:space="preserve">הספרות מבחינה בין מתן בחירה לבין תמיכה באוטונומיה במובן הרחב. מחקר ישראלי שבחן התנהגויות מורים מצא שמתן בחירה תורם למעורבות, אך שהתנהגויות אחרות תורמות אף יותר: הסבר של הרלוונטיות של המשימה לחיי התלמיד, הקשבה לביקורת שלו, ומתן אפשרות לעבוד בדרכו. לעומת זאת, דיכוי ביטוי של דעות והתערבות בקצב העבודה נמצאו פוגעים במעורבות (Assor et al., 2002). ריב (Reeve, 2009) מוסיף שמורה תומך אוטונומיה מקשיב, מציג שיקולים במקום פקודות, מכיר ברגשות שליליים של תלמידים כלפי משימה, ומשתמש בשפה מזמינה ולא כופה.</w:t>
+      </w:r>
+    </w:p>
+    <w:p>
+      <w:pPr>
+        <w:bidi/>
+        <w:spacing w:after="120" w:line="360"/>
+        <w:jc w:val="both"/>
+      </w:pPr>
+      <w:r>
+        <w:rPr>
+          <w:rFonts w:ascii="Times New Roman" w:cs="David" w:eastAsia="David" w:hAnsi="Times New Roman"/>
+          <w:b w:val="false"/>
+          <w:bCs w:val="false"/>
+          <w:i w:val="false"/>
+          <w:iCs w:val="false"/>
+          <w:sz w:val="24"/>
+          <w:szCs w:val="24"/>
+          <w:rtl/>
+        </w:rPr>
+        <w:t xml:space="preserve">מטה-אנליזה של מחקרים על בחירה מצאה שמתן בחירה משפיע לטובה על מוטיבציה פנימית, על מאמץ, על ביצוע ועל תחושת מסוגלות, אך שהאפקט תלוי בתנאים: בחירה בין מספר מצומצם של אפשרויות, שתיים עד ארבע, יעילה יותר מבחירה בין רבות; בחירה שנוגעת לעניין משמעותי, כמו דרך הביצוע של משימה, יעילה יותר מבחירה טכנית; ובחירות שאינן מלוות בלחץ חיצוני יעילות יותר (Patall et al., 2008). מכאן שמתן בחירה בדרך ההבעה, כפי שמציעה טומלינסון בהתאמת התוצר, הוא דוגמה לצומת שבו הוראה מותאמת ותמיכה באוטונומיה נפגשות: התלמיד בוחר כיצד להראות את הבנתו, ובכך גם מתאים את המשימה לחוזקותיו וגם חווה בעלות עליה.</w:t>
+      </w:r>
+    </w:p>
+    <w:p>
+      <w:pPr>
+        <w:bidi/>
+        <w:spacing w:after="120" w:line="360"/>
+        <w:jc w:val="both"/>
+      </w:pPr>
+      <w:r>
+        <w:rPr>
+          <w:rFonts w:ascii="Times New Roman" w:cs="David" w:eastAsia="David" w:hAnsi="Times New Roman"/>
+          <w:b w:val="false"/>
+          <w:bCs w:val="false"/>
+          <w:i w:val="false"/>
+          <w:iCs w:val="false"/>
+          <w:sz w:val="24"/>
+          <w:szCs w:val="24"/>
+          <w:rtl/>
+        </w:rPr>
+        <w:t xml:space="preserve">כיצד נותנים אוטונומיה בשיעור בפועל? ריב מפרט התנהגויות מורה שנמצאו תומכות באוטונומיה: להסביר מדוע המשימה חשובה ומה הקשר שלה לחיי התלמיד; להשתמש בשפה מזמינה, כגון 'אפשר', 'אם תרצו' ו'מה דעתכם', במקום בשפה כופה, כגון 'חייבים' ו'אסור'; להכיר ברגשות שליליים של תלמידים כלפי משימה במקום לבטל אותם; להקשיב לפני שמגיבים; ולתת זמן לעבודה עצמאית בלי להתערב בקצב (Reeve, 2009). אסור ואחרים (Assor et al., 2002) מוסיפים שההתנהגות שנמצאה מזיקה ביותר היא דיכוי של ביקורת ושל ביטוי דעה. מנקודת המבט של ההיוטגוגיה, גלסנר (2024) מציע שהבחירה תנבע מעניין ומסקרנות של הלומדים ולא רק מתפריט שהמורה קבע, כלומר שהמורה תשאיר מקום גם להצעות שהתלמידים מביאים בעצמם. אלה פעולות קטנות בניסוח ובזמן, אך הספרות מייחסת להן השפעה על המוטיבציה שאינה נופלת מזו של מתן הבחירה עצמו.</w:t>
       </w:r>
     </w:p>
     <w:p>
@@ -975,27 +975,27 @@
           <w:szCs w:val="24"/>
           <w:rtl/>
         </w:rPr>
-        <w:t xml:space="preserve">הבסיס הקוגניטיבי לשימוש בייצוג חזותי הוא תאוריית הקידוד הכפול, שלפיה מידע מילולי ומידע חזותי מעובדים בשני ערוצים נפרדים, וכאשר הם משולבים הזיכרון וההבנה משתפרים (Paivio, 1986). מאייר פיתח מכך עקרונות ללמידה ממולטימדיה, ובהם העיקרון שלומדים מבינים טוב יותר ממילים ותמונות יחד מאשר ממילים בלבד, ושהתמונה יעילה במיוחד כאשר היא מוצגת בסמוך להסבר ולא מנותקת ממנו (Mayer, 2009). לתלמידים שמתקשים בקריאה, הערוץ החזותי מאפשר גישה לרעיון בלי לעבור תחילה דרך מחסום הטקסט, ובכך הוא מממש את עקרון הייצוג המרובה של העיצוב האוניברסלי ללמידה (Meyer et al., 2014).</w:t>
-      </w:r>
-    </w:p>
-    <w:p>
-      <w:pPr>
-        <w:bidi/>
-        <w:spacing w:after="120" w:line="360"/>
-        <w:jc w:val="both"/>
-      </w:pPr>
-      <w:r>
-        <w:rPr>
-          <w:rFonts w:ascii="Times New Roman" w:cs="David" w:eastAsia="David" w:hAnsi="Times New Roman"/>
-          <w:b w:val="false"/>
-          <w:bCs w:val="false"/>
-          <w:i w:val="false"/>
-          <w:iCs w:val="false"/>
-          <w:sz w:val="24"/>
-          <w:szCs w:val="24"/>
-          <w:rtl/>
-        </w:rPr>
-        <w:t xml:space="preserve">בהוראת ההיסטוריה התמונה אינה רק אמצעי המחשה, אלא מקור היסטורי בפני עצמו. ויינברג מראה שחשיבה היסטורית היא מיומנות של קריאת מקורות: לשאול מי יצר את המקור, מתי, לאיזו מטרה ומה הוא מגלה על תקופתו. קריאה כזו אפשרית גם בתמונה, בכרזה או בצילום, ולעיתים קל יותר להתחיל אותה דווקא במקור חזותי, שאינו דורש שליטה בשפה כתובה של תקופה אחרת (Wineburg, 2001). לבסטיק וברטון מתארים כיצד תלמידים בגילאי חטיבת הביניים מפתחים הבנה היסטורית דרך חקירה של צילומים וחפצים, במעבר מתצפית על פרטים אל הסקת מסקנות ואל העלאת שאלות (Levstik &amp; Barton, 2011).</w:t>
+        <w:t xml:space="preserve">הבסיס הקוגניטיבי לשימוש בייצוג חזותי הוא תאוריית הקידוד הכפול, שלפיה מידע מילולי ומידע חזותי מעובדים בשני ערוצים נפרדים, וכאשר הם משולבים הזיכרון וההבנה משתפרים (Paivio, 1986). מאייר (Mayer, 2009) פיתח מכך עקרונות ללמידה ממולטימדיה, ובהם העיקרון שלומדים מבינים טוב יותר ממילים ותמונות יחד מאשר ממילים בלבד, ושהתמונה יעילה במיוחד כאשר היא מוצגת בסמוך להסבר ולא מנותקת ממנו. לתלמידים שמתקשים בקריאה, הערוץ החזותי מאפשר גישה לרעיון בלי לעבור תחילה דרך מחסום הטקסט, ובכך הוא מממש את עקרון הייצוג המרובה של העיצוב האוניברסלי ללמידה (Meyer et al., 2014).</w:t>
+      </w:r>
+    </w:p>
+    <w:p>
+      <w:pPr>
+        <w:bidi/>
+        <w:spacing w:after="120" w:line="360"/>
+        <w:jc w:val="both"/>
+      </w:pPr>
+      <w:r>
+        <w:rPr>
+          <w:rFonts w:ascii="Times New Roman" w:cs="David" w:eastAsia="David" w:hAnsi="Times New Roman"/>
+          <w:b w:val="false"/>
+          <w:bCs w:val="false"/>
+          <w:i w:val="false"/>
+          <w:iCs w:val="false"/>
+          <w:sz w:val="24"/>
+          <w:szCs w:val="24"/>
+          <w:rtl/>
+        </w:rPr>
+        <w:t xml:space="preserve">בהוראת ההיסטוריה התמונה אינה רק אמצעי המחשה, אלא מקור היסטורי בפני עצמו. ויינברג מראה שחשיבה היסטורית היא מיומנות של קריאת מקורות: לשאול מי יצר את המקור, מתי, לאיזו מטרה ומה הוא מגלה על תקופתו. קריאה כזו אפשרית גם בתמונה, בכרזה או בצילום, ולעיתים קל יותר להתחיל אותה דווקא במקור חזותי, שאינו דורש שליטה בשפה כתובה של תקופה אחרת (Wineburg, 2001). לבסטיק וברטון (Levstik &amp; Barton, 2011) מתארים כיצד תלמידים בגילאי חטיבת הביניים מפתחים הבנה היסטורית דרך חקירה של צילומים וחפצים, במעבר מתצפית על פרטים אל הסקת מסקנות ואל העלאת שאלות.</w:t>
       </w:r>
     </w:p>
     <w:p>
@@ -1035,7 +1035,7 @@
           <w:szCs w:val="24"/>
           <w:rtl/>
         </w:rPr>
-        <w:t xml:space="preserve">כלי מעשי להנחיית ההתבוננות הן שגרות חשיבה, רצפים קבועים של שאלות שהתלמידים לומדים להפעיל בעצמם. ריצ׳הארט, צ׳רץ׳ ומוריסון מתארים שגרה בת שלושה צעדים לעבודה עם תמונה: מה אתם רואים, מה אתם חושבים על מה שאתם רואים, ומה זה מעורר בכם לשאול. הצעד הראשון דורש להישאר בתיאור בלי לפרש, ולכן הוא נגיש לכל תלמיד; הצעד השני מבקש פירוש מנומק; והשלישי מוליד שאלות חקר (Ritchhart, Church &amp; Morrison, 2011). המחברים ממליצים לתת דקת התבוננות שקטה לפני שמדברים, לאסוף את התשובות על הלוח כך שהכיתה רואה שיש ריבוי של תצפיות לגיטימיות, ולהשתמש בשאלה 'מה גורם לך לומר זאת?' כדי לחבר כל פירוש לפרט בתמונה. בהוראת היסטוריה שגרה כזו מובילה בטבעיות אל השאלות הדיסציפלינריות: מי צילם, מתי, ומה נשאר מחוץ לפריים (Wineburg, 2001).</w:t>
+        <w:t xml:space="preserve">כלי מעשי להנחיית ההתבוננות הן שגרות חשיבה, רצפים קבועים של שאלות שהתלמידים לומדים להפעיל בעצמם. ריצ׳הארט ואחרים (Ritchhart et al., 2011) מתארים שגרה בת שלושה צעדים לעבודה עם תמונה: מה אתם רואים, מה אתם חושבים על מה שאתם רואים, ומה זה מעורר בכם לשאול. הצעד הראשון דורש להישאר בתיאור בלי לפרש, ולכן הוא נגיש לכל תלמיד; הצעד השני מבקש פירוש מנומק; והשלישי מוליד שאלות חקר. המחברים ממליצים לתת דקת התבוננות שקטה לפני שמדברים, לאסוף את התשובות על הלוח כך שהכיתה רואה שיש ריבוי של תצפיות לגיטימיות, ולהשתמש בשאלה 'מה גורם לך לומר זאת?' כדי לחבר כל פירוש לפרט בתמונה. בהוראת היסטוריה שגרה כזו מובילה בטבעיות אל השאלות הדיסציפלינריות: מי צילם, מתי, ומה נשאר מחוץ לפריים (Wineburg, 2001).</w:t>
       </w:r>
     </w:p>
     <w:p>
@@ -1097,7 +1097,7 @@
           <w:szCs w:val="24"/>
           <w:rtl/>
         </w:rPr>
-        <w:t xml:space="preserve">מחקרים ישראליים מתארים מה מורות לומדות בדרך זו. רונן (2019) מתעדת את התפתחותה כמובילת תהליך חינוכי ומראה כיצד תיעוד מתמשך ובחינה חוזרת של הפעולות הובילו אותה לזהות פערים בין הראוי למצוי, להשהות תגובות אוטומטיות ולסבול אי-ודאות. מנדלר, עמיר, האופטמן וגורב (2020) עוקבים אחר סטודנטים להוראה שניסחו שאלת מחקר פעולה, ומתארים מעבר מתחושת אי-נחת כללית לשאלה ממוקדת על פעולותיהם שלהם, מעבר שהם מכנים כניסה למרחב בטוח. מחקר על מורות ותיקות שהתנסו בהוראה קשובה, שיטה דיאלוגית שבה הלומדים מייצגים מושגים באמצעות ציורים והסברים בכתב, מתאר שינוי תפיסתי מהוראה כהעברת ידע חד-כיוונית להוראה ולמידה כתהליך הדדי, ומצביע על הציור ככלי לעקוב אחר השינוי המושגי של הלומד (שור וגוברמן, 2023). ממחקרים אלה עולה שהוראה מותאמת אינה נרכשת רק מקריאה על אסטרטגיות, אלא מניסיון מתועד בכיתה, שבו המורה בודקת מה קורה כאשר היא משנה פעולה אחת, ולומדת מכך על ההנחות שלה עצמה.</w:t>
+        <w:t xml:space="preserve">מחקרים ישראליים מתארים מה מורות לומדות בדרך זו. רונן (2019) מתעדת את התפתחותה כמובילת תהליך חינוכי ומראה כיצד תיעוד מתמשך ובחינה חוזרת של הפעולות הובילו אותה לזהות פערים בין הראוי למצוי, להשהות תגובות אוטומטיות ולסבול אי-ודאות. מנדלר ואחרים (2020) עוקבים אחר סטודנטים להוראה שניסחו שאלת מחקר פעולה, ומתארים מעבר מתחושת אי-נחת כללית לשאלה ממוקדת על פעולותיהם שלהם, מעבר שהם מכנים כניסה למרחב בטוח. מחקר על מורות ותיקות שהתנסו בהוראה קשובה, שיטה דיאלוגית שבה הלומדים מייצגים מושגים באמצעות ציורים והסברים בכתב, מתאר שינוי תפיסתי מהוראה כהעברת ידע חד-כיוונית להוראה ולמידה כתהליך הדדי, ומצביע על הציור ככלי לעקוב אחר השינוי המושגי של הלומד (שור וגוברמן, 2023). ממחקרים אלה עולה שהוראה מותאמת אינה נרכשת רק מקריאה על אסטרטגיות, אלא מניסיון מתועד בכיתה, שבו המורה בודקת מה קורה כאשר היא משנה פעולה אחת, ולומדת מכך על ההנחות שלה עצמה.</w:t>
       </w:r>
     </w:p>
     <w:p>
@@ -1624,7 +1624,7 @@
       <w:pPr>
         <w:keepNext/>
         <w:bidi/>
-        <w:spacing w:after="80" w:before="120" w:line="360"/>
+        <w:spacing w:after="0" w:before="120" w:line="360" w:lineRule="auto"/>
         <w:jc w:val="right"/>
       </w:pPr>
       <w:r>
@@ -1638,7 +1638,28 @@
           <w:szCs w:val="24"/>
           <w:rtl/>
         </w:rPr>
-        <w:t xml:space="preserve">לוח 1: המורות שרואיינו במחקר הגישוש (שמות בדויים)</w:t>
+        <w:t xml:space="preserve">לוח 1</w:t>
+      </w:r>
+    </w:p>
+    <w:p>
+      <w:pPr>
+        <w:keepNext/>
+        <w:bidi/>
+        <w:spacing w:after="80" w:before="0" w:line="360" w:lineRule="auto"/>
+        <w:jc w:val="right"/>
+      </w:pPr>
+      <w:r>
+        <w:rPr>
+          <w:rFonts w:ascii="Times New Roman" w:cs="David" w:eastAsia="David" w:hAnsi="Times New Roman"/>
+          <w:b w:val="false"/>
+          <w:bCs w:val="false"/>
+          <w:i/>
+          <w:iCs/>
+          <w:sz w:val="24"/>
+          <w:szCs w:val="24"/>
+          <w:rtl/>
+        </w:rPr>
+        <w:t xml:space="preserve">המורות שרואיינו במחקר הגישוש (שמות בדויים)</w:t>
       </w:r>
     </w:p>
     <w:tbl>
@@ -3246,7 +3267,7 @@
       <w:pPr>
         <w:keepNext/>
         <w:bidi/>
-        <w:spacing w:after="80" w:before="120" w:line="360"/>
+        <w:spacing w:after="0" w:before="120" w:line="360" w:lineRule="auto"/>
         <w:jc w:val="right"/>
       </w:pPr>
       <w:r>
@@ -3260,7 +3281,28 @@
           <w:szCs w:val="24"/>
           <w:rtl/>
         </w:rPr>
-        <w:t>לוח 2: חמשת מפגשי מחקר הפעולה, הפעולות שתכננתי וכלי התיעוד</w:t>
+        <w:t xml:space="preserve">לוח 2</w:t>
+      </w:r>
+    </w:p>
+    <w:p>
+      <w:pPr>
+        <w:keepNext/>
+        <w:bidi/>
+        <w:spacing w:after="80" w:before="0" w:line="360" w:lineRule="auto"/>
+        <w:jc w:val="right"/>
+      </w:pPr>
+      <w:r>
+        <w:rPr>
+          <w:rFonts w:ascii="Times New Roman" w:cs="David" w:eastAsia="David" w:hAnsi="Times New Roman"/>
+          <w:b w:val="false"/>
+          <w:bCs w:val="false"/>
+          <w:i/>
+          <w:iCs/>
+          <w:sz w:val="24"/>
+          <w:szCs w:val="24"/>
+          <w:rtl/>
+        </w:rPr>
+        <w:t xml:space="preserve">חמשת מפגשי מחקר הפעולה, הפעולות שתכננתי וכלי התיעוד</w:t>
       </w:r>
     </w:p>
     <w:tbl>
@@ -5794,7 +5836,7 @@
           <w:szCs w:val="24"/>
           <w:rtl/>
         </w:rPr>
-        <w:t xml:space="preserve">שתי תמונות להצגה בשיתוף מסך: ציור של עיר תעשייתית באנגליה במאה התשע עשרה, ובו מפעלים וארובות, קטר קיטור, עגלה רתומה לסוסים, תעלת מים ופועלים (תמונה 1), ותמונה של אתר תעשייתי בן ימינו במדבר, ובו ארובות, טורבינות רוח ולוחות סולאריים (תמונה 2).</w:t>
+        <w:t xml:space="preserve">שתי תמונות להצגה בשיתוף מסך: ציור של עיר תעשייתית באנגליה במאה התשע עשרה, ובו מפעלים וארובות, קטר קיטור, עגלה רתומה לסוסים, תעלת מים ופועלים (איור 1), ותמונה של אתר תעשייתי בן ימינו במדבר, ובו ארובות, טורבינות רוח ולוחות סולאריים (איור 2).</w:t>
       </w:r>
     </w:p>
     <w:p>
@@ -5953,14 +5995,56 @@
           <w:szCs w:val="24"/>
           <w:rtl/>
         </w:rPr>
-        <w:t xml:space="preserve">המפגש התקיים ביום רביעי, 4.3.2026, באמצעות אפליקציית זום, עם תלמידי כיתה ח׳3, בליווי מורת המקצוע. נכחו 26 תלמידים. התחושה שלי הייתה שונה לחלוטין מזו שבשיעור שבו זיהיתי את הבעיה: שילוב של התרגשות וחשש. לפני המפגש שאלתי את עצמי: האם תמונה אחת יכולה להחליף טקסט שלם? האם אצליח להעביר את הרעיונות דרך המסך? פתחתי בברכת שלום ובהתעניינות בשלומם נוכח התקופה המאתגרת שבה אנו נמצאים, ולאחר מכן, במקום להסביר, הצגתי בשיתוף מסך את תמונה 1, ללא כותרת וללא כל הסבר מוקדם, וביקשתי מהם רק להתבונן בה דקה בשקט.</w:t>
+        <w:t xml:space="preserve">המפגש התקיים ביום רביעי, 4.3.2026, באמצעות אפליקציית זום, עם תלמידי כיתה ח׳3, בליווי מורת המקצוע. נכחו 26 תלמידים. התחושה שלי הייתה שונה לחלוטין מזו שבשיעור שבו זיהיתי את הבעיה: שילוב של התרגשות וחשש. לפני המפגש שאלתי את עצמי: האם תמונה אחת יכולה להחליף טקסט שלם? האם אצליח להעביר את הרעיונות דרך המסך? פתחתי בברכת שלום ובהתעניינות בשלומם נוכח התקופה המאתגרת שבה אנו נמצאים, ולאחר מכן, במקום להסביר, הצגתי בשיתוף מסך את איור 1, ללא כותרת וללא כל הסבר מוקדם, וביקשתי מהם רק להתבונן בה דקה בשקט.</w:t>
       </w:r>
     </w:p>
     <w:p>
       <w:pPr>
         <w:keepNext/>
         <w:bidi/>
-        <w:spacing w:after="60" w:before="120" w:line="240" w:lineRule="auto"/>
+        <w:spacing w:after="0" w:before="0" w:line="360" w:lineRule="auto"/>
+        <w:jc w:val="right"/>
+      </w:pPr>
+      <w:r>
+        <w:rPr>
+          <w:rFonts w:ascii="Times New Roman" w:cs="David" w:eastAsia="David" w:hAnsi="Times New Roman"/>
+          <w:b/>
+          <w:bCs/>
+          <w:i w:val="false"/>
+          <w:iCs w:val="false"/>
+          <w:sz w:val="24"/>
+          <w:szCs w:val="24"/>
+          <w:rtl/>
+        </w:rPr>
+        <w:t xml:space="preserve">איור 1</w:t>
+      </w:r>
+    </w:p>
+    <w:p>
+      <w:pPr>
+        <w:keepNext/>
+        <w:bidi/>
+        <w:spacing w:after="60" w:before="0" w:line="360" w:lineRule="auto"/>
+        <w:jc w:val="right"/>
+      </w:pPr>
+      <w:r>
+        <w:rPr>
+          <w:rFonts w:ascii="Times New Roman" w:cs="David" w:eastAsia="David" w:hAnsi="Times New Roman"/>
+          <w:b w:val="false"/>
+          <w:bCs w:val="false"/>
+          <w:i/>
+          <w:iCs/>
+          <w:sz w:val="24"/>
+          <w:szCs w:val="24"/>
+          <w:rtl/>
+        </w:rPr>
+        <w:t xml:space="preserve">ציור של עיר תעשייתית באנגליה במאה התשע עשרה, כפי שהוצג לתלמידים בשיתוף מסך במפגש השני</w:t>
+      </w:r>
+    </w:p>
+    <w:p>
+      <w:pPr>
+        <w:keepNext/>
+        <w:bidi/>
+        <w:spacing w:after="60" w:before="0" w:line="240" w:lineRule="auto"/>
         <w:jc w:val="center"/>
       </w:pPr>
       <w:r>
@@ -5971,7 +6055,7 @@
           <wp:inline distT="0" distB="0" distL="0" distR="0">
             <wp:extent cx="4663440" cy="3108959"/>
             <wp:effectExtent l="0" t="0" r="0" b="0"/>
-            <wp:docPr id="101" name="Picture 101" descr="תמונה 1: ציור של עיר תעשייתית באנגליה במאה התשע עשרה, כפי שהוצג לתלמידים בשיתוף מסך במפגש השני"/>
+            <wp:docPr id="101" name="Picture 101" descr="איור 1: ציור של עיר תעשייתית באנגליה במאה התשע עשרה, כפי שהוצג לתלמידים בשיתוף מסך במפגש השני"/>
             <wp:cNvGraphicFramePr>
               <a:graphicFrameLocks xmlns:a="http://schemas.openxmlformats.org/drawingml/2006/main" noChangeAspect="1"/>
             </wp:cNvGraphicFramePr>
@@ -6007,21 +6091,48 @@
     <w:p>
       <w:pPr>
         <w:bidi/>
-        <w:spacing w:after="240" w:before="60" w:line="360"/>
-        <w:jc w:val="center"/>
-      </w:pPr>
-      <w:r>
-        <w:rPr>
-          <w:rFonts w:ascii="Times New Roman" w:cs="David" w:eastAsia="David" w:hAnsi="Times New Roman"/>
-          <w:b/>
-          <w:bCs/>
-          <w:i w:val="false"/>
-          <w:iCs w:val="false"/>
+        <w:spacing w:after="240" w:before="0" w:line="360" w:lineRule="auto"/>
+        <w:jc w:val="both"/>
+      </w:pPr>
+      <w:r>
+        <w:rPr>
+          <w:rFonts w:ascii="Times New Roman" w:cs="David" w:eastAsia="David" w:hAnsi="Times New Roman"/>
+          <w:b w:val="false"/>
+          <w:bCs w:val="false"/>
+          <w:i/>
+          <w:iCs/>
           <w:sz w:val="22"/>
           <w:szCs w:val="22"/>
           <w:rtl/>
         </w:rPr>
-        <w:t xml:space="preserve">תמונה 1: ציור של עיר תעשייתית באנגליה במאה התשע עשרה, כפי שהוצג לתלמידים בשיתוף מסך במפגש השני</w:t>
+        <w:t xml:space="preserve">הערה. </w:t>
+      </w:r>
+      <w:r>
+        <w:rPr>
+          <w:rFonts w:ascii="Times New Roman" w:cs="David" w:eastAsia="David" w:hAnsi="Times New Roman"/>
+          <w:b w:val="false"/>
+          <w:bCs w:val="false"/>
+          <w:i w:val="false"/>
+          <w:iCs w:val="false"/>
+          <w:sz w:val="22"/>
+          <w:szCs w:val="22"/>
+          <w:rtl/>
+        </w:rPr>
+        <w:t xml:space="preserve">התמונה הוצגה לתלמידים בשיתוף מסך. מקור התמונה: </w:t>
+      </w:r>
+      <w:r>
+        <w:rPr>
+          <w:rFonts w:ascii="Times New Roman" w:cs="David" w:eastAsia="David" w:hAnsi="Times New Roman"/>
+          <w:b w:val="false"/>
+          <w:bCs w:val="false"/>
+          <w:i w:val="false"/>
+          <w:iCs w:val="false"/>
+          <w:sz w:val="22"/>
+          <w:szCs w:val="22"/>
+          <w:highlight w:val="yellow"/>
+          <w:rtl/>
+        </w:rPr>
+        <w:t xml:space="preserve">[להשלים: שם היוצר או האתר וכתובת URL]</w:t>
       </w:r>
     </w:p>
     <w:p>
@@ -6223,14 +6334,56 @@
           <w:szCs w:val="24"/>
           <w:rtl/>
         </w:rPr>
-        <w:t xml:space="preserve">לאחר כרבע שעה של דיון במליאה חילקתי את התלמידים לזוגות בחדרים קטנים. בכל חדר הוצגו זו לצד זו תמונה 1 ותמונה 2, ואיתן דף העבודה הדיגיטלי שבניתי לפי אסטרטגיית תצפית והסקה, ובו שלוש שאלות מדורגות: מה אתם רואים בכל תמונה, מה דומה ומה שונה בין השתיים, ומה זה מלמד על מה שהשתנה. עברתי בין החדרים יחד עם מורת המקצוע.</w:t>
+        <w:t xml:space="preserve">לאחר כרבע שעה של דיון במליאה חילקתי את התלמידים לזוגות בחדרים קטנים. בכל חדר הוצגו זו לצד זו איור 1 ואיור 2, ואיתן דף העבודה הדיגיטלי שבניתי לפי אסטרטגיית תצפית והסקה, ובו שלוש שאלות מדורגות: מה אתם רואים בכל תמונה, מה דומה ומה שונה בין השתיים, ומה זה מלמד על מה שהשתנה. עברתי בין החדרים יחד עם מורת המקצוע.</w:t>
       </w:r>
     </w:p>
     <w:p>
       <w:pPr>
         <w:keepNext/>
         <w:bidi/>
-        <w:spacing w:after="60" w:before="120" w:line="240" w:lineRule="auto"/>
+        <w:spacing w:after="0" w:before="0" w:line="360" w:lineRule="auto"/>
+        <w:jc w:val="right"/>
+      </w:pPr>
+      <w:r>
+        <w:rPr>
+          <w:rFonts w:ascii="Times New Roman" w:cs="David" w:eastAsia="David" w:hAnsi="Times New Roman"/>
+          <w:b/>
+          <w:bCs/>
+          <w:i w:val="false"/>
+          <w:iCs w:val="false"/>
+          <w:sz w:val="24"/>
+          <w:szCs w:val="24"/>
+          <w:rtl/>
+        </w:rPr>
+        <w:t xml:space="preserve">איור 2</w:t>
+      </w:r>
+    </w:p>
+    <w:p>
+      <w:pPr>
+        <w:keepNext/>
+        <w:bidi/>
+        <w:spacing w:after="60" w:before="0" w:line="360" w:lineRule="auto"/>
+        <w:jc w:val="right"/>
+      </w:pPr>
+      <w:r>
+        <w:rPr>
+          <w:rFonts w:ascii="Times New Roman" w:cs="David" w:eastAsia="David" w:hAnsi="Times New Roman"/>
+          <w:b w:val="false"/>
+          <w:bCs w:val="false"/>
+          <w:i/>
+          <w:iCs/>
+          <w:sz w:val="24"/>
+          <w:szCs w:val="24"/>
+          <w:rtl/>
+        </w:rPr>
+        <w:t xml:space="preserve">אתר תעשייתי בן ימינו במדבר, עם ארובות, טורבינות רוח ולוחות סולאריים, כפי שהוצג לצד איור 1 בחדרים הקטנים</w:t>
+      </w:r>
+    </w:p>
+    <w:p>
+      <w:pPr>
+        <w:keepNext/>
+        <w:bidi/>
+        <w:spacing w:after="60" w:before="0" w:line="240" w:lineRule="auto"/>
         <w:jc w:val="center"/>
       </w:pPr>
       <w:r>
@@ -6241,7 +6394,7 @@
           <wp:inline distT="0" distB="0" distL="0" distR="0">
             <wp:extent cx="2496697" cy="3840480"/>
             <wp:effectExtent l="0" t="0" r="0" b="0"/>
-            <wp:docPr id="102" name="Picture 102" descr="תמונה 2: תמונה של אתר תעשייתי בן ימינו במדבר, עם ארובות, טורבינות רוח ולוחות סולאריים, שהוצגה לצד תמונה 1 בחדרים הקטנים"/>
+            <wp:docPr id="102" name="Picture 102" descr="איור 2: תמונה של אתר תעשייתי בן ימינו במדבר, עם ארובות, טורבינות רוח ולוחות סולאריים, שהוצגה לצד איור 1 בחדרים הקטנים"/>
             <wp:cNvGraphicFramePr>
               <a:graphicFrameLocks xmlns:a="http://schemas.openxmlformats.org/drawingml/2006/main" noChangeAspect="1"/>
             </wp:cNvGraphicFramePr>
@@ -6277,41 +6430,68 @@
     <w:p>
       <w:pPr>
         <w:bidi/>
-        <w:spacing w:after="240" w:before="60" w:line="360"/>
-        <w:jc w:val="center"/>
-      </w:pPr>
-      <w:r>
-        <w:rPr>
-          <w:rFonts w:ascii="Times New Roman" w:cs="David" w:eastAsia="David" w:hAnsi="Times New Roman"/>
-          <w:b/>
-          <w:bCs/>
-          <w:i w:val="false"/>
-          <w:iCs w:val="false"/>
+        <w:spacing w:after="240" w:before="0" w:line="360" w:lineRule="auto"/>
+        <w:jc w:val="both"/>
+      </w:pPr>
+      <w:r>
+        <w:rPr>
+          <w:rFonts w:ascii="Times New Roman" w:cs="David" w:eastAsia="David" w:hAnsi="Times New Roman"/>
+          <w:b w:val="false"/>
+          <w:bCs w:val="false"/>
+          <w:i/>
+          <w:iCs/>
           <w:sz w:val="22"/>
           <w:szCs w:val="22"/>
           <w:rtl/>
         </w:rPr>
-        <w:t xml:space="preserve">תמונה 2: תמונה של אתר תעשייתי בן ימינו במדבר, עם ארובות, טורבינות רוח ולוחות סולאריים, שהוצגה לצד תמונה 1 בחדרים הקטנים</w:t>
-      </w:r>
-    </w:p>
-    <w:p>
-      <w:pPr>
-        <w:bidi/>
-        <w:spacing w:after="120" w:line="360"/>
-        <w:jc w:val="both"/>
-      </w:pPr>
-      <w:r>
-        <w:rPr>
-          <w:rFonts w:ascii="Times New Roman" w:cs="David" w:eastAsia="David" w:hAnsi="Times New Roman"/>
-          <w:b w:val="false"/>
-          <w:bCs w:val="false"/>
-          <w:i w:val="false"/>
-          <w:iCs w:val="false"/>
-          <w:sz w:val="24"/>
-          <w:szCs w:val="24"/>
-          <w:rtl/>
-        </w:rPr>
-        <w:t xml:space="preserve">בתמונה 2 נראה אתר תעשייתי במדבר בשעת שקיעה: שני מגדלי ארובות עצומים שמהם עולה עשן, טורבינות רוח, שדות של לוחות סולאריים, מסילה ומבנים מוארים, וכמעט אין בה בני אדם. בחרתי בה בעקבות עצתה של סוזאן בריאיון, שהציעה להוסיף "תמונה של היום", משום שבלי היום התלמידים אינם יכולים לשאול מה השתנה, ושאלת השינוי היא שאלת היחידה כולה. באחד החדרים, שבו עבדו סאמי ותלמיד נוסף, שמעתי את סאמי שואל באופן ספונטני, כשהוא מצביע על תמונה 1:</w:t>
+        <w:t xml:space="preserve">הערה. </w:t>
+      </w:r>
+      <w:r>
+        <w:rPr>
+          <w:rFonts w:ascii="Times New Roman" w:cs="David" w:eastAsia="David" w:hAnsi="Times New Roman"/>
+          <w:b w:val="false"/>
+          <w:bCs w:val="false"/>
+          <w:i w:val="false"/>
+          <w:iCs w:val="false"/>
+          <w:sz w:val="22"/>
+          <w:szCs w:val="22"/>
+          <w:rtl/>
+        </w:rPr>
+        <w:t xml:space="preserve">התמונה הוצגה לתלמידים בשיתוף מסך. מקור התמונה: </w:t>
+      </w:r>
+      <w:r>
+        <w:rPr>
+          <w:rFonts w:ascii="Times New Roman" w:cs="David" w:eastAsia="David" w:hAnsi="Times New Roman"/>
+          <w:b w:val="false"/>
+          <w:bCs w:val="false"/>
+          <w:i w:val="false"/>
+          <w:iCs w:val="false"/>
+          <w:sz w:val="22"/>
+          <w:szCs w:val="22"/>
+          <w:highlight w:val="yellow"/>
+          <w:rtl/>
+        </w:rPr>
+        <w:t xml:space="preserve">[להשלים: שם היוצר או האתר וכתובת URL]</w:t>
+      </w:r>
+    </w:p>
+    <w:p>
+      <w:pPr>
+        <w:bidi/>
+        <w:spacing w:after="120" w:line="360"/>
+        <w:jc w:val="both"/>
+      </w:pPr>
+      <w:r>
+        <w:rPr>
+          <w:rFonts w:ascii="Times New Roman" w:cs="David" w:eastAsia="David" w:hAnsi="Times New Roman"/>
+          <w:b w:val="false"/>
+          <w:bCs w:val="false"/>
+          <w:i w:val="false"/>
+          <w:iCs w:val="false"/>
+          <w:sz w:val="24"/>
+          <w:szCs w:val="24"/>
+          <w:rtl/>
+        </w:rPr>
+        <w:t xml:space="preserve">באיור 2 נראה אתר תעשייתי במדבר בשעת שקיעה: שני מגדלי ארובות עצומים שמהם עולה עשן, טורבינות רוח, שדות של לוחות סולאריים, מסילה ומבנים מוארים, וכמעט אין בה בני אדם. בחרתי בה בעקבות עצתה של סוזאן בריאיון, שהציעה להוסיף "תמונה של היום", משום שבלי היום התלמידים אינם יכולים לשאול מה השתנה, ושאלת השינוי היא שאלת היחידה כולה. באחד החדרים, שבו עבדו סאמי ותלמיד נוסף, שמעתי את סאמי שואל באופן ספונטני, כשהוא מצביע על איור 1:</w:t>
       </w:r>
     </w:p>
     <w:p>
@@ -6957,7 +7137,7 @@
           <w:szCs w:val="24"/>
           <w:rtl/>
         </w:rPr>
-        <w:t xml:space="preserve">המשפט הזה חידד עבורי שהתלמידים אינם דוחים למידה, אלא את אופן הביטוי היחיד שדרשתי מהם עד כה. באותו מפגש הכין אחמד על דף תרשים של הדגם שתכנן, עיר עם מפעלים ובתים, ורשם לעצמו רשימת חומרים: קופסאות, גלילי נייר, צמר גפן, צבעים. את הדגם עצמו בנה בבית במהלך השבוע, כפי שעשו גם שאר התלמידים שבחרו בדגם, ועל כך בסעיף 5ה. גם תלמידים אחרים בחרו דרכים שונות: רים כתבה מכתב מנקודת מבטה של ילדה בת שתים עשרה העובדת במפעל טקסטיל, ופתחה אותו במילים "אימא יקרה, היום שוב קמתי בחמש. הידיים שלי שחורות מהשמן של המכונה"; עומר (שם בדוי) צייר את הקטר מתמונה 1 ומאחוריו סוסים ההולכים וקטנים עד שהם נעלמים, וכששאלתי אותו על הציור אמר:</w:t>
+        <w:t xml:space="preserve">המשפט הזה חידד עבורי שהתלמידים אינם דוחים למידה, אלא את אופן הביטוי היחיד שדרשתי מהם עד כה. באותו מפגש הכין אחמד על דף תרשים של הדגם שתכנן, עיר עם מפעלים ובתים, ורשם לעצמו רשימת חומרים: קופסאות, גלילי נייר, צמר גפן, צבעים. את הדגם עצמו בנה בבית במהלך השבוע, כפי שעשו גם שאר התלמידים שבחרו בדגם, ועל כך בסעיף 5ה. גם תלמידים אחרים בחרו דרכים שונות: רים כתבה מכתב מנקודת מבטה של ילדה בת שתים עשרה העובדת במפעל טקסטיל, ופתחה אותו במילים "אימא יקרה, היום שוב קמתי בחמש. הידיים שלי שחורות מהשמן של המכונה"; עומר (שם בדוי) צייר את הקטר מאיור 1 ומאחוריו סוסים ההולכים וקטנים עד שהם נעלמים, וכששאלתי אותו על הציור אמר:</w:t>
       </w:r>
     </w:p>
     <w:p>
@@ -7311,14 +7491,56 @@
           <w:szCs w:val="24"/>
           <w:rtl/>
         </w:rPr>
-        <w:t xml:space="preserve">הדגם של אחמד (תמונה 3) נבנה מקופסאות קרטון ומגלילי נייר. שישה בניינים צבועים באדום, בצהוב ובכחול, עם חלונות מצוירים בטוש שחור, עומדים על לוח שעליו צייר כביש שחור ודשא ירוק; לצידם ומאחוריהם שבע ארובות, גלילי קרטון צבועים בשחור ובתכלת עם פסים צהובים, ומפיהן יוצא עשן מצמר גפן. בין הבניינים תקע עצי דקל מפלסטיק. אחמד סיפר לי שעבד על הדגם בבית במשך שלושה ערבים, לבדו, ושאת הארובות עשה מגלילי נייר "כי הם כבר עגולים".</w:t>
+        <w:t xml:space="preserve">הדגם של אחמד (איור 3) נבנה מקופסאות קרטון ומגלילי נייר. שישה בניינים צבועים באדום, בצהוב ובכחול, עם חלונות מצוירים בטוש שחור, עומדים על לוח שעליו צייר כביש שחור ודשא ירוק; לצידם ומאחוריהם שבע ארובות, גלילי קרטון צבועים בשחור ובתכלת עם פסים צהובים, ומפיהן יוצא עשן מצמר גפן. בין הבניינים תקע עצי דקל מפלסטיק. אחמד סיפר לי שעבד על הדגם בבית במשך שלושה ערבים, לבדו, ושאת הארובות עשה מגלילי נייר "כי הם כבר עגולים".</w:t>
       </w:r>
     </w:p>
     <w:p>
       <w:pPr>
         <w:keepNext/>
         <w:bidi/>
-        <w:spacing w:after="60" w:before="120" w:line="240" w:lineRule="auto"/>
+        <w:spacing w:after="0" w:before="0" w:line="360" w:lineRule="auto"/>
+        <w:jc w:val="right"/>
+      </w:pPr>
+      <w:r>
+        <w:rPr>
+          <w:rFonts w:ascii="Times New Roman" w:cs="David" w:eastAsia="David" w:hAnsi="Times New Roman"/>
+          <w:b/>
+          <w:bCs/>
+          <w:i w:val="false"/>
+          <w:iCs w:val="false"/>
+          <w:sz w:val="24"/>
+          <w:szCs w:val="24"/>
+          <w:rtl/>
+        </w:rPr>
+        <w:t xml:space="preserve">איור 3</w:t>
+      </w:r>
+    </w:p>
+    <w:p>
+      <w:pPr>
+        <w:keepNext/>
+        <w:bidi/>
+        <w:spacing w:after="60" w:before="0" w:line="360" w:lineRule="auto"/>
+        <w:jc w:val="right"/>
+      </w:pPr>
+      <w:r>
+        <w:rPr>
+          <w:rFonts w:ascii="Times New Roman" w:cs="David" w:eastAsia="David" w:hAnsi="Times New Roman"/>
+          <w:b w:val="false"/>
+          <w:bCs w:val="false"/>
+          <w:i/>
+          <w:iCs/>
+          <w:sz w:val="24"/>
+          <w:szCs w:val="24"/>
+          <w:rtl/>
+        </w:rPr>
+        <w:t xml:space="preserve">הדגם שבנה אחמד: מפעלים וארובות מעשנות לצד בנייני מגורים ועצים</w:t>
+      </w:r>
+    </w:p>
+    <w:p>
+      <w:pPr>
+        <w:keepNext/>
+        <w:bidi/>
+        <w:spacing w:after="60" w:before="0" w:line="240" w:lineRule="auto"/>
         <w:jc w:val="center"/>
       </w:pPr>
       <w:r>
@@ -7329,7 +7551,7 @@
           <wp:inline distT="0" distB="0" distL="0" distR="0">
             <wp:extent cx="4569963" cy="3108959"/>
             <wp:effectExtent l="0" t="0" r="0" b="0"/>
-            <wp:docPr id="103" name="Picture 103" descr="תמונה 3: הדגם שבנה אחמד: מפעלים וארובות מעשנות לצד בנייני מגורים ועצים (צולם ללא פרטים מזהים)"/>
+            <wp:docPr id="103" name="Picture 103" descr="איור 3: הדגם שבנה אחמד: מפעלים וארובות מעשנות לצד בנייני מגורים ועצים (צולם ללא פרטים מזהים)"/>
             <wp:cNvGraphicFramePr>
               <a:graphicFrameLocks xmlns:a="http://schemas.openxmlformats.org/drawingml/2006/main" noChangeAspect="1"/>
             </wp:cNvGraphicFramePr>
@@ -7365,21 +7587,34 @@
     <w:p>
       <w:pPr>
         <w:bidi/>
-        <w:spacing w:after="240" w:before="60" w:line="360"/>
-        <w:jc w:val="center"/>
-      </w:pPr>
-      <w:r>
-        <w:rPr>
-          <w:rFonts w:ascii="Times New Roman" w:cs="David" w:eastAsia="David" w:hAnsi="Times New Roman"/>
-          <w:b/>
-          <w:bCs/>
-          <w:i w:val="false"/>
-          <w:iCs w:val="false"/>
+        <w:spacing w:after="240" w:before="0" w:line="360" w:lineRule="auto"/>
+        <w:jc w:val="both"/>
+      </w:pPr>
+      <w:r>
+        <w:rPr>
+          <w:rFonts w:ascii="Times New Roman" w:cs="David" w:eastAsia="David" w:hAnsi="Times New Roman"/>
+          <w:b w:val="false"/>
+          <w:bCs w:val="false"/>
+          <w:i/>
+          <w:iCs/>
           <w:sz w:val="22"/>
           <w:szCs w:val="22"/>
           <w:rtl/>
         </w:rPr>
-        <w:t xml:space="preserve">תמונה 3: הדגם שבנה אחמד: מפעלים וארובות מעשנות לצד בנייני מגורים ועצים (צולם ללא פרטים מזהים)</w:t>
+        <w:t xml:space="preserve">הערה. </w:t>
+      </w:r>
+      <w:r>
+        <w:rPr>
+          <w:rFonts w:ascii="Times New Roman" w:cs="David" w:eastAsia="David" w:hAnsi="Times New Roman"/>
+          <w:b w:val="false"/>
+          <w:bCs w:val="false"/>
+          <w:i w:val="false"/>
+          <w:iCs w:val="false"/>
+          <w:sz w:val="22"/>
+          <w:szCs w:val="22"/>
+          <w:rtl/>
+        </w:rPr>
+        <w:t xml:space="preserve">צילום של המחברת. התוצר צולם ללא פרטים מזהים של התלמיד.</w:t>
       </w:r>
     </w:p>
     <w:p>
@@ -7453,7 +7688,7 @@
           <w:szCs w:val="24"/>
           <w:rtl/>
         </w:rPr>
-        <w:t xml:space="preserve">תלמידה מהקבוצה שאלה אותו למה שם עצים אם יש עשן, והוא ענה: "כי גם היום יש עצים ליד המפעלים. זה לא עוזר, אבל שמים". כששאלתי איך הוא יודע שאנשים גרו ליד המפעלים, הצביע על החלונות בבניינים ואמר שבתמונה 1 "הבתים היו ממש ליד הארובות". ביומן תיארתי את הרגע כך:</w:t>
+        <w:t xml:space="preserve">תלמידה מהקבוצה שאלה אותו למה שם עצים אם יש עשן, והוא ענה: "כי גם היום יש עצים ליד המפעלים. זה לא עוזר, אבל שמים". כששאלתי איך הוא יודע שאנשים גרו ליד המפעלים, הצביע על החלונות בבניינים ואמר שבאיור 1 "הבתים היו ממש ליד הארובות". ביומן תיארתי את הרגע כך:</w:t>
       </w:r>
     </w:p>
     <w:p>
@@ -7527,14 +7762,56 @@
           <w:szCs w:val="24"/>
           <w:rtl/>
         </w:rPr>
-        <w:t xml:space="preserve">סאמי ושותפו הביאו דגם מסוג אחר (תמונה 4): בית כחול מקרטון עם גג גלי חום, ולידו גלגל של מכונית צעצוע המורכב על מנוע חשמלי קטן. כשמסובבים את הגלגל בעיפרון, נדלקת נורה קטנה בקיר הבית. סאמי, ששאל במפגש השני למה אנשים לא ברחו מהעשן, הסביר לקבוצה:</w:t>
+        <w:t xml:space="preserve">סאמי ושותפו הביאו דגם מסוג אחר (איור 4): בית כחול מקרטון עם גג גלי חום, ולידו גלגל של מכונית צעצוע המורכב על מנוע חשמלי קטן. כשמסובבים את הגלגל בעיפרון, נדלקת נורה קטנה בקיר הבית. סאמי, ששאל במפגש השני למה אנשים לא ברחו מהעשן, הסביר לקבוצה:</w:t>
       </w:r>
     </w:p>
     <w:p>
       <w:pPr>
         <w:keepNext/>
         <w:bidi/>
-        <w:spacing w:after="60" w:before="120" w:line="240" w:lineRule="auto"/>
+        <w:spacing w:after="0" w:before="0" w:line="360" w:lineRule="auto"/>
+        <w:jc w:val="right"/>
+      </w:pPr>
+      <w:r>
+        <w:rPr>
+          <w:rFonts w:ascii="Times New Roman" w:cs="David" w:eastAsia="David" w:hAnsi="Times New Roman"/>
+          <w:b/>
+          <w:bCs/>
+          <w:i w:val="false"/>
+          <w:iCs w:val="false"/>
+          <w:sz w:val="24"/>
+          <w:szCs w:val="24"/>
+          <w:rtl/>
+        </w:rPr>
+        <w:t xml:space="preserve">איור 4</w:t>
+      </w:r>
+    </w:p>
+    <w:p>
+      <w:pPr>
+        <w:keepNext/>
+        <w:bidi/>
+        <w:spacing w:after="60" w:before="0" w:line="360" w:lineRule="auto"/>
+        <w:jc w:val="right"/>
+      </w:pPr>
+      <w:r>
+        <w:rPr>
+          <w:rFonts w:ascii="Times New Roman" w:cs="David" w:eastAsia="David" w:hAnsi="Times New Roman"/>
+          <w:b w:val="false"/>
+          <w:bCs w:val="false"/>
+          <w:i/>
+          <w:iCs/>
+          <w:sz w:val="24"/>
+          <w:szCs w:val="24"/>
+          <w:rtl/>
+        </w:rPr>
+        <w:t xml:space="preserve">הדגם שבנו סאמי ושותפו: בית שבו נדלקת נורה כשמסובבים את הגלגל המחובר למנוע</w:t>
+      </w:r>
+    </w:p>
+    <w:p>
+      <w:pPr>
+        <w:keepNext/>
+        <w:bidi/>
+        <w:spacing w:after="60" w:before="0" w:line="240" w:lineRule="auto"/>
         <w:jc w:val="center"/>
       </w:pPr>
       <w:r>
@@ -7545,7 +7822,7 @@
           <wp:inline distT="0" distB="0" distL="0" distR="0">
             <wp:extent cx="2904953" cy="3657600"/>
             <wp:effectExtent l="0" t="0" r="0" b="0"/>
-            <wp:docPr id="104" name="Picture 104" descr="תמונה 4: הדגם שבנו סאמי ושותפו: בית שבו נדלקת נורה כשמסובבים את הגלגל המחובר למנוע"/>
+            <wp:docPr id="104" name="Picture 104" descr="איור 4: הדגם שבנו סאמי ושותפו: בית שבו נדלקת נורה כשמסובבים את הגלגל המחובר למנוע"/>
             <wp:cNvGraphicFramePr>
               <a:graphicFrameLocks xmlns:a="http://schemas.openxmlformats.org/drawingml/2006/main" noChangeAspect="1"/>
             </wp:cNvGraphicFramePr>
@@ -7581,21 +7858,34 @@
     <w:p>
       <w:pPr>
         <w:bidi/>
-        <w:spacing w:after="240" w:before="60" w:line="360"/>
-        <w:jc w:val="center"/>
-      </w:pPr>
-      <w:r>
-        <w:rPr>
-          <w:rFonts w:ascii="Times New Roman" w:cs="David" w:eastAsia="David" w:hAnsi="Times New Roman"/>
-          <w:b/>
-          <w:bCs/>
-          <w:i w:val="false"/>
-          <w:iCs w:val="false"/>
+        <w:spacing w:after="240" w:before="0" w:line="360" w:lineRule="auto"/>
+        <w:jc w:val="both"/>
+      </w:pPr>
+      <w:r>
+        <w:rPr>
+          <w:rFonts w:ascii="Times New Roman" w:cs="David" w:eastAsia="David" w:hAnsi="Times New Roman"/>
+          <w:b w:val="false"/>
+          <w:bCs w:val="false"/>
+          <w:i/>
+          <w:iCs/>
           <w:sz w:val="22"/>
           <w:szCs w:val="22"/>
           <w:rtl/>
         </w:rPr>
-        <w:t xml:space="preserve">תמונה 4: הדגם שבנו סאמי ושותפו: בית שבו נדלקת נורה כשמסובבים את הגלגל המחובר למנוע</w:t>
+        <w:t xml:space="preserve">הערה. </w:t>
+      </w:r>
+      <w:r>
+        <w:rPr>
+          <w:rFonts w:ascii="Times New Roman" w:cs="David" w:eastAsia="David" w:hAnsi="Times New Roman"/>
+          <w:b w:val="false"/>
+          <w:bCs w:val="false"/>
+          <w:i w:val="false"/>
+          <w:iCs w:val="false"/>
+          <w:sz w:val="22"/>
+          <w:szCs w:val="22"/>
+          <w:rtl/>
+        </w:rPr>
+        <w:t xml:space="preserve">צילום של המחברת. התוצר צולם ללא פרטים מזהים של התלמיד.</w:t>
       </w:r>
     </w:p>
     <w:p>
@@ -7771,7 +8061,7 @@
           <w:szCs w:val="22"/>
           <w:rtl/>
         </w:rPr>
-        <w:t xml:space="preserve">הדבר הקשה ביותר היום היה לשתוק. שלוש פעמים לפחות התחלתי לתקן, למשל כשקבוצה אמרה שהעשן בתמונה 2 הוא "מהמלחמה", ועצרתי את עצמי ורשמתי. לינא צדקה: החלק הקשה בגלריה הוא לא ההכנה. מה שלמדתי היום על עצמי הוא שכשאני עומדת בצד אני רואה את הכיתה, וכשאני עומדת במרכז אני רואה רק את מי שמסתכל עליי. את הטעויות שרשמתי אפתח בהן את המפגש הבא, כמו שהציעה סמאח: "קבוצה אחת חשבה ש... בואו נבדוק".</w:t>
+        <w:t xml:space="preserve">הדבר הקשה ביותר היום היה לשתוק. שלוש פעמים לפחות התחלתי לתקן, למשל כשקבוצה אמרה שהעשן באיור 2 הוא "מהמלחמה", ועצרתי את עצמי ורשמתי. לינא צדקה: החלק הקשה בגלריה הוא לא ההכנה. מה שלמדתי היום על עצמי הוא שכשאני עומדת בצד אני רואה את הכיתה, וכשאני עומדת במרכז אני רואה רק את מי שמסתכל עליי. את הטעויות שרשמתי אפתח בהן את המפגש הבא, כמו שהציעה סמאח: "קבוצה אחת חשבה ש... בואו נבדוק".</w:t>
       </w:r>
     </w:p>
     <w:p>
@@ -8454,7 +8744,7 @@
           <w:szCs w:val="24"/>
           <w:rtl/>
         </w:rPr>
-        <w:t xml:space="preserve">גלסנר, א׳ (2024). היוטגוגיה: הוראה המזמינה למידה דיאלוגית אותנטית והדדית בהכשרת מורים. </w:t>
+        <w:t xml:space="preserve">גלסנר, א. (2024). היוטגוגיה: הוראה המזמינה למידה דיאלוגית אותנטית והדדית בהכשרת מורים. </w:t>
       </w:r>
       <w:r>
         <w:rPr>
@@ -8495,7 +8785,7 @@
           <w:szCs w:val="24"/>
           <w:rtl/>
         </w:rPr>
-        <w:t xml:space="preserve">ג׳וסלסון, ר׳ (2015). </w:t>
+        <w:t xml:space="preserve">ג׳וסלסון, ר. (2015). </w:t>
       </w:r>
       <w:r>
         <w:rPr>
@@ -8536,7 +8826,7 @@
           <w:szCs w:val="24"/>
           <w:rtl/>
         </w:rPr>
-        <w:t xml:space="preserve">גירץ, ק׳ (1990). </w:t>
+        <w:t xml:space="preserve">גירץ, ק. (1990). </w:t>
       </w:r>
       <w:r>
         <w:rPr>
@@ -8577,7 +8867,7 @@
           <w:szCs w:val="24"/>
           <w:rtl/>
         </w:rPr>
-        <w:t xml:space="preserve">הרפז, י׳ ויצחקי, נ׳ (2021). בחזרה וקדימה ליסודות! הוראה לשם הבנה והנעה להבנה. </w:t>
+        <w:t xml:space="preserve">הרפז, י. ויצחקי, נ. (2021). בחזרה וקדימה ליסודות! הוראה לשם הבנה והנעה להבנה. </w:t>
       </w:r>
       <w:r>
         <w:rPr>
@@ -8618,7 +8908,7 @@
           <w:szCs w:val="24"/>
           <w:rtl/>
         </w:rPr>
-        <w:t xml:space="preserve">לוין, ק׳ (1989). מחקר פעולה ובעיות של קבוצת מיעוט. בתוך ד׳ בר-גל (עורך), </w:t>
+        <w:t xml:space="preserve">לוין, ק. (1989). מחקר פעולה ובעיות של קבוצת מיעוט. בתוך ד. בר-גל (עורך), </w:t>
       </w:r>
       <w:r>
         <w:rPr>
@@ -8659,7 +8949,7 @@
           <w:szCs w:val="24"/>
           <w:rtl/>
         </w:rPr>
-        <w:t xml:space="preserve">מוגדם, י׳ (2021). מהמרחב המוזאוני אל המורה לאומנות. </w:t>
+        <w:t xml:space="preserve">מוגדם, י. (2021). מהמרחב המוזאוני אל המורה לאומנות. </w:t>
       </w:r>
       <w:r>
         <w:rPr>
@@ -8700,7 +8990,7 @@
           <w:szCs w:val="24"/>
           <w:rtl/>
         </w:rPr>
-        <w:t xml:space="preserve">מנדלר, ד׳, עמיר, ע׳, האופטמן, ש׳ וגורב, ד׳ (2020). בין אי-נחת למרחב בטוח: ניסוח שאלת מחקר בקרב סטודנטים להוראה העורכים מחקר פעולה. </w:t>
+        <w:t xml:space="preserve">מנדלר, ד., עמיר, ע., האופטמן, ש. וגורב, ד. (2020). בין אי-נחת למרחב בטוח: ניסוח שאלת מחקר בקרב סטודנטים להוראה העורכים מחקר פעולה. </w:t>
       </w:r>
       <w:r>
         <w:rPr>
@@ -8741,7 +9031,7 @@
           <w:szCs w:val="24"/>
           <w:rtl/>
         </w:rPr>
-        <w:t xml:space="preserve">מרנין-דיסטלפלד, ש׳ (2021). "פעם היינו": ללמוד היסטוריה באמצעות משחק קלפים. </w:t>
+        <w:t xml:space="preserve">מרנין-דיסטלפלד, ש. (2021). "פעם היינו": ללמוד היסטוריה באמצעות משחק קלפים. </w:t>
       </w:r>
       <w:r>
         <w:rPr>
@@ -8782,7 +9072,7 @@
           <w:szCs w:val="24"/>
           <w:rtl/>
         </w:rPr>
-        <w:t xml:space="preserve">עזר, ח׳ (2010). שיח רפלקטיבי ככלי למחקר עצמי בידי המורה-החוקר: ניתוח שיח ביקורתי. בתוך ע׳ קופפרברג (עורכת), </w:t>
+        <w:t xml:space="preserve">עזר, ח. (2010). שיח רפלקטיבי ככלי למחקר עצמי בידי המורה-החוקר: ניתוח שיח ביקורתי. בתוך ע. קופפרברג (עורכת), </w:t>
       </w:r>
       <w:r>
         <w:rPr>
@@ -8823,7 +9113,7 @@
           <w:szCs w:val="24"/>
           <w:rtl/>
         </w:rPr>
-        <w:t xml:space="preserve">צלרמאיר, מ׳ (2001). מחקר פעולה בחינוך: היסטוריה, מאפיינים, ביקורת. בתוך נ׳ צבר בן-יהושע (עורכת), </w:t>
+        <w:t xml:space="preserve">צלרמאיר, מ. (2001). מחקר פעולה בחינוך: היסטוריה, מאפיינים, ביקורת. בתוך נ. צבר בן-יהושע (עורכת), </w:t>
       </w:r>
       <w:r>
         <w:rPr>
@@ -8864,7 +9154,7 @@
           <w:szCs w:val="24"/>
           <w:rtl/>
         </w:rPr>
-        <w:t xml:space="preserve">רייכל, נ׳ ואלט, ד׳ (2023). מוכנותם ותגובתם של מורות ומורים בבתי ספר יסודיים ובחטיבות ביניים למשבר הקורונה: חסמים וגורמים שסייעו להתמודד עם המשבר. </w:t>
+        <w:t xml:space="preserve">רייכל, נ. ואלט, ד. (2023). מוכנותם ותגובתם של מורות ומורים בבתי ספר יסודיים ובחטיבות ביניים למשבר הקורונה: חסמים וגורמים שסייעו להתמודד עם המשבר. </w:t>
       </w:r>
       <w:r>
         <w:rPr>
@@ -8927,7 +9217,7 @@
           <w:szCs w:val="24"/>
           <w:rtl/>
         </w:rPr>
-        <w:t xml:space="preserve">רונן, א׳ (2019). בחינת התפתחותה של מובילת תהליך חינוכי: מעגלי מחקר ועשייה. </w:t>
+        <w:t xml:space="preserve">רונן, א. (2019). בחינת התפתחותה של מובילת תהליך חינוכי: מעגלי מחקר ועשייה. </w:t>
       </w:r>
       <w:r>
         <w:rPr>
@@ -8962,13 +9252,41 @@
       <w:r>
         <w:rPr>
           <w:rFonts w:ascii="Times New Roman" w:cs="David" w:eastAsia="David" w:hAnsi="Times New Roman"/>
-          <w:i w:val="false"/>
-          <w:iCs w:val="false"/>
-          <w:sz w:val="24"/>
-          <w:szCs w:val="24"/>
-          <w:rtl/>
-        </w:rPr>
-        <w:t xml:space="preserve">שור, י׳ וגוברמן, ע׳ (2023). שינוי תפיסתי של המושג "הוראה / למידה" בקרב מורות ותיקות בעקבות התנסות בהוראה קשובה. במעגלי חינוך: מחקר, עיון ויצירה, 12. https://www.dyellin.ac.il/sites/default/files/journals/journaleducation/edition12/perceptual_change_regarding_the_term_teaching_or_learning_among_veteran_teachers_fallowing_experiencing_attentive_learning.pdf</w:t>
+          <w:b w:val="false"/>
+          <w:bCs w:val="false"/>
+          <w:i w:val="false"/>
+          <w:iCs w:val="false"/>
+          <w:sz w:val="24"/>
+          <w:szCs w:val="24"/>
+          <w:rtl/>
+        </w:rPr>
+        <w:t xml:space="preserve">שור, י. וגוברמן, ע. (2023). שינוי תפיסתי של המושג "הוראה / למידה" בקרב מורות ותיקות בעקבות התנסות בהוראה קשובה. </w:t>
+      </w:r>
+      <w:r>
+        <w:rPr>
+          <w:rFonts w:ascii="Times New Roman" w:cs="David" w:eastAsia="David" w:hAnsi="Times New Roman"/>
+          <w:b w:val="false"/>
+          <w:bCs w:val="false"/>
+          <w:i/>
+          <w:iCs/>
+          <w:sz w:val="24"/>
+          <w:szCs w:val="24"/>
+          <w:rtl/>
+        </w:rPr>
+        <w:t xml:space="preserve">במעגלי חינוך: מחקר, עיון ויצירה, 12</w:t>
+      </w:r>
+      <w:r>
+        <w:rPr>
+          <w:rFonts w:ascii="Times New Roman" w:cs="David" w:eastAsia="David" w:hAnsi="Times New Roman"/>
+          <w:b w:val="false"/>
+          <w:bCs w:val="false"/>
+          <w:i w:val="false"/>
+          <w:iCs w:val="false"/>
+          <w:sz w:val="24"/>
+          <w:szCs w:val="24"/>
+          <w:rtl/>
+        </w:rPr>
+        <w:t xml:space="preserve">. https://www.dyellin.ac.il/sites/default/files/journals/journaleducation/edition12/perceptual_change_regarding_the_term_teaching_or_learning_among_veteran_teachers_fallowing_experiencing_attentive_learning.pdf</w:t>
       </w:r>
     </w:p>
     <w:p>
@@ -8987,7 +9305,7 @@
           <w:szCs w:val="24"/>
           <w:rtl/>
         </w:rPr>
-        <w:t xml:space="preserve">שלסקי, ש׳ (2006). מחקר פעולה כמחקר רפלקסיבי. בתוך ד׳ לוי (עורכת), </w:t>
+        <w:t xml:space="preserve">שלסקי, ש. (2006). מחקר פעולה כמחקר רפלקסיבי. בתוך ד. לוי (עורכת), </w:t>
       </w:r>
       <w:r>
         <w:rPr>
@@ -9028,7 +9346,7 @@
           <w:szCs w:val="24"/>
           <w:rtl/>
         </w:rPr>
-        <w:t xml:space="preserve">שקדי, א׳ (2003). </w:t>
+        <w:t xml:space="preserve">שקדי, א. (2003). </w:t>
       </w:r>
       <w:r>
         <w:rPr>

</xml_diff>

<commit_message>
Remove image-source placeholders under figures 1 and 2
Co-Authored-By: Claude Fable 5.1 <noreply@anthropic.com>
Claude-Session: https://claude.ai/code/session_011Z9C2ptByc9jQga6MDruQz
</commit_message>
<xml_diff>
--- a/deliverables/סמינריון_הדיל_אחרי_משוב_גילת.docx
+++ b/deliverables/סמינריון_הדיל_אחרי_משוב_גילת.docx
@@ -6107,33 +6107,6 @@
         </w:rPr>
         <w:t xml:space="preserve">הערה. </w:t>
       </w:r>
-      <w:r>
-        <w:rPr>
-          <w:rFonts w:ascii="Times New Roman" w:cs="David" w:eastAsia="David" w:hAnsi="Times New Roman"/>
-          <w:b w:val="false"/>
-          <w:bCs w:val="false"/>
-          <w:i w:val="false"/>
-          <w:iCs w:val="false"/>
-          <w:sz w:val="22"/>
-          <w:szCs w:val="22"/>
-          <w:rtl/>
-        </w:rPr>
-        <w:t xml:space="preserve">התמונה הוצגה לתלמידים בשיתוף מסך. מקור התמונה: </w:t>
-      </w:r>
-      <w:r>
-        <w:rPr>
-          <w:rFonts w:ascii="Times New Roman" w:cs="David" w:eastAsia="David" w:hAnsi="Times New Roman"/>
-          <w:b w:val="false"/>
-          <w:bCs w:val="false"/>
-          <w:i w:val="false"/>
-          <w:iCs w:val="false"/>
-          <w:sz w:val="22"/>
-          <w:szCs w:val="22"/>
-          <w:highlight w:val="yellow"/>
-          <w:rtl/>
-        </w:rPr>
-        <w:t xml:space="preserve">[להשלים: שם היוצר או האתר וכתובת URL]</w:t>
-      </w:r>
     </w:p>
     <w:p>
       <w:pPr>
@@ -6445,33 +6418,6 @@
           <w:rtl/>
         </w:rPr>
         <w:t xml:space="preserve">הערה. </w:t>
-      </w:r>
-      <w:r>
-        <w:rPr>
-          <w:rFonts w:ascii="Times New Roman" w:cs="David" w:eastAsia="David" w:hAnsi="Times New Roman"/>
-          <w:b w:val="false"/>
-          <w:bCs w:val="false"/>
-          <w:i w:val="false"/>
-          <w:iCs w:val="false"/>
-          <w:sz w:val="22"/>
-          <w:szCs w:val="22"/>
-          <w:rtl/>
-        </w:rPr>
-        <w:t xml:space="preserve">התמונה הוצגה לתלמידים בשיתוף מסך. מקור התמונה: </w:t>
-      </w:r>
-      <w:r>
-        <w:rPr>
-          <w:rFonts w:ascii="Times New Roman" w:cs="David" w:eastAsia="David" w:hAnsi="Times New Roman"/>
-          <w:b w:val="false"/>
-          <w:bCs w:val="false"/>
-          <w:i w:val="false"/>
-          <w:iCs w:val="false"/>
-          <w:sz w:val="22"/>
-          <w:szCs w:val="22"/>
-          <w:highlight w:val="yellow"/>
-          <w:rtl/>
-        </w:rPr>
-        <w:t xml:space="preserve">[להשלים: שם היוצר או האתר וכתובת URL]</w:t>
       </w:r>
     </w:p>
     <w:p>

</xml_diff>

<commit_message>
Fix figure notes text after removing source placeholders
Co-Authored-By: Claude Fable 5.1 <noreply@anthropic.com>
Claude-Session: https://claude.ai/code/session_011Z9C2ptByc9jQga6MDruQz
</commit_message>
<xml_diff>
--- a/deliverables/סמינריון_הדיל_אחרי_משוב_גילת.docx
+++ b/deliverables/סמינריון_הדיל_אחרי_משוב_גילת.docx
@@ -6107,6 +6107,19 @@
         </w:rPr>
         <w:t xml:space="preserve">הערה. </w:t>
       </w:r>
+      <w:r>
+        <w:rPr>
+          <w:rFonts w:ascii="Times New Roman" w:cs="David" w:eastAsia="David" w:hAnsi="Times New Roman"/>
+          <w:b w:val="false"/>
+          <w:bCs w:val="false"/>
+          <w:i w:val="false"/>
+          <w:iCs w:val="false"/>
+          <w:sz w:val="22"/>
+          <w:szCs w:val="22"/>
+          <w:rtl/>
+        </w:rPr>
+        <w:t xml:space="preserve">התמונה הוצגה לתלמידים בשיתוף מסך.</w:t>
+      </w:r>
     </w:p>
     <w:p>
       <w:pPr>
@@ -6418,6 +6431,19 @@
           <w:rtl/>
         </w:rPr>
         <w:t xml:space="preserve">הערה. </w:t>
+      </w:r>
+      <w:r>
+        <w:rPr>
+          <w:rFonts w:ascii="Times New Roman" w:cs="David" w:eastAsia="David" w:hAnsi="Times New Roman"/>
+          <w:b w:val="false"/>
+          <w:bCs w:val="false"/>
+          <w:i w:val="false"/>
+          <w:iCs w:val="false"/>
+          <w:sz w:val="22"/>
+          <w:szCs w:val="22"/>
+          <w:rtl/>
+        </w:rPr>
+        <w:t xml:space="preserve">התמונה הוצגה לתלמידים בשיתוף מסך.</w:t>
       </w:r>
     </w:p>
     <w:p>

</xml_diff>